<commit_message>
may, source docs update
</commit_message>
<xml_diff>
--- a/flow/20230914_vu_template/Стихири - Мінея/Мінея_05_Травень.docx
+++ b/flow/20230914_vu_template/Стихири - Мінея/Мінея_05_Травень.docx
@@ -1139,7 +1139,25 @@
           <w:sz w:val="24"/>
           <w:szCs w:val="24"/>
         </w:rPr>
-        <w:t xml:space="preserve">Преподобний отче, Богопроповіднику Атанасію,* ти, злигодні перетерпівши й часті напасті,* нині поживи райської сподобився єси;* </w:t>
+        <w:t xml:space="preserve">Преподобний отче, Богопроповіднику Атанасію,* ти, злигодні перетерпівши й часті напасті,* нині поживи райської </w:t>
+      </w:r>
+      <w:proofErr w:type="spellStart"/>
+      <w:r>
+        <w:rPr>
+          <w:rFonts w:ascii="Times New Roman" w:eastAsia="Times New Roman" w:hAnsi="Times New Roman" w:cs="Times New Roman"/>
+          <w:sz w:val="24"/>
+          <w:szCs w:val="24"/>
+        </w:rPr>
+        <w:t>сподобився</w:t>
+      </w:r>
+      <w:proofErr w:type="spellEnd"/>
+      <w:r>
+        <w:rPr>
+          <w:rFonts w:ascii="Times New Roman" w:eastAsia="Times New Roman" w:hAnsi="Times New Roman" w:cs="Times New Roman"/>
+          <w:sz w:val="24"/>
+          <w:szCs w:val="24"/>
+        </w:rPr>
+        <w:t xml:space="preserve"> єси;* </w:t>
       </w:r>
       <w:proofErr w:type="spellStart"/>
       <w:r>
@@ -1834,7 +1852,25 @@
           <w:sz w:val="24"/>
           <w:szCs w:val="24"/>
         </w:rPr>
-        <w:t xml:space="preserve"> Божественне стадо;* і церкву ту негайно воздвиг </w:t>
+        <w:t xml:space="preserve"> Божественне стадо;* і церкву ту негайно </w:t>
+      </w:r>
+      <w:proofErr w:type="spellStart"/>
+      <w:r>
+        <w:rPr>
+          <w:rFonts w:ascii="Times New Roman" w:eastAsia="Times New Roman" w:hAnsi="Times New Roman" w:cs="Times New Roman"/>
+          <w:sz w:val="24"/>
+          <w:szCs w:val="24"/>
+        </w:rPr>
+        <w:t>воздвиг</w:t>
+      </w:r>
+      <w:proofErr w:type="spellEnd"/>
+      <w:r>
+        <w:rPr>
+          <w:rFonts w:ascii="Times New Roman" w:eastAsia="Times New Roman" w:hAnsi="Times New Roman" w:cs="Times New Roman"/>
+          <w:sz w:val="24"/>
+          <w:szCs w:val="24"/>
+        </w:rPr>
+        <w:t xml:space="preserve"> </w:t>
       </w:r>
       <w:proofErr w:type="spellStart"/>
       <w:r>
@@ -8094,7 +8130,25 @@
           <w:sz w:val="24"/>
           <w:szCs w:val="24"/>
         </w:rPr>
-        <w:t xml:space="preserve">, Дівственнику і </w:t>
+        <w:t xml:space="preserve">, </w:t>
+      </w:r>
+      <w:proofErr w:type="spellStart"/>
+      <w:r>
+        <w:rPr>
+          <w:rFonts w:ascii="Times New Roman" w:eastAsia="Times New Roman" w:hAnsi="Times New Roman" w:cs="Times New Roman"/>
+          <w:sz w:val="24"/>
+          <w:szCs w:val="24"/>
+        </w:rPr>
+        <w:t>Дівственнику</w:t>
+      </w:r>
+      <w:proofErr w:type="spellEnd"/>
+      <w:r>
+        <w:rPr>
+          <w:rFonts w:ascii="Times New Roman" w:eastAsia="Times New Roman" w:hAnsi="Times New Roman" w:cs="Times New Roman"/>
+          <w:sz w:val="24"/>
+          <w:szCs w:val="24"/>
+        </w:rPr>
+        <w:t xml:space="preserve"> і </w:t>
       </w:r>
       <w:proofErr w:type="spellStart"/>
       <w:r>
@@ -8906,7 +8960,25 @@
           <w:sz w:val="24"/>
           <w:szCs w:val="24"/>
         </w:rPr>
-        <w:t>Преподобний отче,* поклик Євангелія Господнього почувши,* ти світ полишив,* багатство і славу за ніщо поставивши.* Тим-то до всіх візвав єси:* «</w:t>
+        <w:t xml:space="preserve">Преподобний отче,* поклик Євангелія Господнього почувши,* ти світ полишив,* багатство і славу за ніщо поставивши.* Тим-то до всіх </w:t>
+      </w:r>
+      <w:proofErr w:type="spellStart"/>
+      <w:r>
+        <w:rPr>
+          <w:rFonts w:ascii="Times New Roman" w:eastAsia="Times New Roman" w:hAnsi="Times New Roman" w:cs="Times New Roman"/>
+          <w:sz w:val="24"/>
+          <w:szCs w:val="24"/>
+        </w:rPr>
+        <w:t>візвав</w:t>
+      </w:r>
+      <w:proofErr w:type="spellEnd"/>
+      <w:r>
+        <w:rPr>
+          <w:rFonts w:ascii="Times New Roman" w:eastAsia="Times New Roman" w:hAnsi="Times New Roman" w:cs="Times New Roman"/>
+          <w:sz w:val="24"/>
+          <w:szCs w:val="24"/>
+        </w:rPr>
+        <w:t xml:space="preserve"> єси:* «</w:t>
       </w:r>
       <w:proofErr w:type="spellStart"/>
       <w:r>
@@ -11159,7 +11231,25 @@
           <w:sz w:val="24"/>
           <w:szCs w:val="24"/>
         </w:rPr>
-        <w:t xml:space="preserve"> таїнником </w:t>
+        <w:t xml:space="preserve"> </w:t>
+      </w:r>
+      <w:proofErr w:type="spellStart"/>
+      <w:r>
+        <w:rPr>
+          <w:rFonts w:ascii="Times New Roman" w:eastAsia="Times New Roman" w:hAnsi="Times New Roman" w:cs="Times New Roman"/>
+          <w:sz w:val="24"/>
+          <w:szCs w:val="24"/>
+        </w:rPr>
+        <w:t>таїнником</w:t>
+      </w:r>
+      <w:proofErr w:type="spellEnd"/>
+      <w:r>
+        <w:rPr>
+          <w:rFonts w:ascii="Times New Roman" w:eastAsia="Times New Roman" w:hAnsi="Times New Roman" w:cs="Times New Roman"/>
+          <w:sz w:val="24"/>
+          <w:szCs w:val="24"/>
+        </w:rPr>
+        <w:t xml:space="preserve"> </w:t>
       </w:r>
       <w:proofErr w:type="spellStart"/>
       <w:r>
@@ -11782,7 +11872,25 @@
           <w:sz w:val="24"/>
           <w:szCs w:val="24"/>
         </w:rPr>
-        <w:t>* Божественними вченнями,* і всіх просвітив славити* одне Божество в Трьох Іпостасях* без розділення чи розсічення.</w:t>
+        <w:t xml:space="preserve">* Божественними </w:t>
+      </w:r>
+      <w:proofErr w:type="spellStart"/>
+      <w:r>
+        <w:rPr>
+          <w:rFonts w:ascii="Times New Roman" w:eastAsia="Times New Roman" w:hAnsi="Times New Roman" w:cs="Times New Roman"/>
+          <w:sz w:val="24"/>
+          <w:szCs w:val="24"/>
+        </w:rPr>
+        <w:t>вченнями</w:t>
+      </w:r>
+      <w:proofErr w:type="spellEnd"/>
+      <w:r>
+        <w:rPr>
+          <w:rFonts w:ascii="Times New Roman" w:eastAsia="Times New Roman" w:hAnsi="Times New Roman" w:cs="Times New Roman"/>
+          <w:sz w:val="24"/>
+          <w:szCs w:val="24"/>
+        </w:rPr>
+        <w:t>,* і всіх просвітив славити* одне Божество в Трьох Іпостасях* без розділення чи розсічення.</w:t>
       </w:r>
     </w:p>
     <w:p>
@@ -12071,7 +12179,25 @@
           <w:sz w:val="24"/>
           <w:szCs w:val="24"/>
         </w:rPr>
-        <w:t xml:space="preserve">!* Ти, напившись із потоку </w:t>
+        <w:t xml:space="preserve">!* Ти, </w:t>
+      </w:r>
+      <w:proofErr w:type="spellStart"/>
+      <w:r>
+        <w:rPr>
+          <w:rFonts w:ascii="Times New Roman" w:eastAsia="Times New Roman" w:hAnsi="Times New Roman" w:cs="Times New Roman"/>
+          <w:sz w:val="24"/>
+          <w:szCs w:val="24"/>
+        </w:rPr>
+        <w:t>напившись</w:t>
+      </w:r>
+      <w:proofErr w:type="spellEnd"/>
+      <w:r>
+        <w:rPr>
+          <w:rFonts w:ascii="Times New Roman" w:eastAsia="Times New Roman" w:hAnsi="Times New Roman" w:cs="Times New Roman"/>
+          <w:sz w:val="24"/>
+          <w:szCs w:val="24"/>
+        </w:rPr>
+        <w:t xml:space="preserve"> із потоку </w:t>
       </w:r>
       <w:proofErr w:type="spellStart"/>
       <w:r>
@@ -12420,7 +12546,25 @@
           <w:sz w:val="24"/>
           <w:szCs w:val="24"/>
         </w:rPr>
-        <w:t xml:space="preserve"> твоїми вченнями спаливши,* ти народи з глибини невідання до пізнання Бога вивів.* І нині молися Христові,* щоб Він милостивий був до нас у День Судний.</w:t>
+        <w:t xml:space="preserve"> твоїми </w:t>
+      </w:r>
+      <w:proofErr w:type="spellStart"/>
+      <w:r>
+        <w:rPr>
+          <w:rFonts w:ascii="Times New Roman" w:eastAsia="Times New Roman" w:hAnsi="Times New Roman" w:cs="Times New Roman"/>
+          <w:sz w:val="24"/>
+          <w:szCs w:val="24"/>
+        </w:rPr>
+        <w:t>вченнями</w:t>
+      </w:r>
+      <w:proofErr w:type="spellEnd"/>
+      <w:r>
+        <w:rPr>
+          <w:rFonts w:ascii="Times New Roman" w:eastAsia="Times New Roman" w:hAnsi="Times New Roman" w:cs="Times New Roman"/>
+          <w:sz w:val="24"/>
+          <w:szCs w:val="24"/>
+        </w:rPr>
+        <w:t xml:space="preserve"> спаливши,* ти народи з глибини невідання до пізнання Бога вивів.* І нині молися Христові,* щоб Він милостивий був до нас у День Судний.</w:t>
       </w:r>
     </w:p>
     <w:p>
@@ -12812,7 +12956,25 @@
           <w:sz w:val="24"/>
           <w:szCs w:val="24"/>
         </w:rPr>
-        <w:t xml:space="preserve"> Тройцю,* Отця, і Сина, і Святого Духа пізнавши,* маємо від Христа Бога велику милість.</w:t>
+        <w:t xml:space="preserve"> </w:t>
+      </w:r>
+      <w:proofErr w:type="spellStart"/>
+      <w:r>
+        <w:rPr>
+          <w:rFonts w:ascii="Times New Roman" w:eastAsia="Times New Roman" w:hAnsi="Times New Roman" w:cs="Times New Roman"/>
+          <w:sz w:val="24"/>
+          <w:szCs w:val="24"/>
+        </w:rPr>
+        <w:t>Тройцю</w:t>
+      </w:r>
+      <w:proofErr w:type="spellEnd"/>
+      <w:r>
+        <w:rPr>
+          <w:rFonts w:ascii="Times New Roman" w:eastAsia="Times New Roman" w:hAnsi="Times New Roman" w:cs="Times New Roman"/>
+          <w:sz w:val="24"/>
+          <w:szCs w:val="24"/>
+        </w:rPr>
+        <w:t>,* Отця, і Сина, і Святого Духа пізнавши,* маємо від Христа Бога велику милість.</w:t>
       </w:r>
     </w:p>
     <w:p>
@@ -13363,7 +13525,25 @@
           <w:sz w:val="24"/>
           <w:szCs w:val="24"/>
         </w:rPr>
-        <w:t xml:space="preserve">Кириле богомудрий і Методію </w:t>
+        <w:t xml:space="preserve">Кириле </w:t>
+      </w:r>
+      <w:proofErr w:type="spellStart"/>
+      <w:r>
+        <w:rPr>
+          <w:rFonts w:ascii="Times New Roman" w:eastAsia="Times New Roman" w:hAnsi="Times New Roman" w:cs="Times New Roman"/>
+          <w:sz w:val="24"/>
+          <w:szCs w:val="24"/>
+        </w:rPr>
+        <w:t>богомудрий</w:t>
+      </w:r>
+      <w:proofErr w:type="spellEnd"/>
+      <w:r>
+        <w:rPr>
+          <w:rFonts w:ascii="Times New Roman" w:eastAsia="Times New Roman" w:hAnsi="Times New Roman" w:cs="Times New Roman"/>
+          <w:sz w:val="24"/>
+          <w:szCs w:val="24"/>
+        </w:rPr>
+        <w:t xml:space="preserve"> і Методію </w:t>
       </w:r>
       <w:proofErr w:type="spellStart"/>
       <w:r>
@@ -13455,7 +13635,25 @@
           <w:sz w:val="24"/>
           <w:szCs w:val="24"/>
         </w:rPr>
-        <w:t xml:space="preserve"> джерело живоносне,* що народи слов’янські, які від спраги знемагали, напоїв;* Методію, чиста молитви обителе!* Христові, якому в славі предстоїте, моліться </w:t>
+        <w:t xml:space="preserve"> джерело живоносне,* що народи слов’янські, які від спраги знемагали, напоїв;* Методію, чиста молитви обителе!* Христові, якому в славі </w:t>
+      </w:r>
+      <w:proofErr w:type="spellStart"/>
+      <w:r>
+        <w:rPr>
+          <w:rFonts w:ascii="Times New Roman" w:eastAsia="Times New Roman" w:hAnsi="Times New Roman" w:cs="Times New Roman"/>
+          <w:sz w:val="24"/>
+          <w:szCs w:val="24"/>
+        </w:rPr>
+        <w:t>предстоїте</w:t>
+      </w:r>
+      <w:proofErr w:type="spellEnd"/>
+      <w:r>
+        <w:rPr>
+          <w:rFonts w:ascii="Times New Roman" w:eastAsia="Times New Roman" w:hAnsi="Times New Roman" w:cs="Times New Roman"/>
+          <w:sz w:val="24"/>
+          <w:szCs w:val="24"/>
+        </w:rPr>
+        <w:t xml:space="preserve">, моліться </w:t>
       </w:r>
       <w:proofErr w:type="spellStart"/>
       <w:r>
@@ -13772,7 +13970,25 @@
           <w:sz w:val="24"/>
           <w:szCs w:val="24"/>
         </w:rPr>
-        <w:t xml:space="preserve"> Прийдіте, всі </w:t>
+        <w:t xml:space="preserve"> </w:t>
+      </w:r>
+      <w:proofErr w:type="spellStart"/>
+      <w:r>
+        <w:rPr>
+          <w:rFonts w:ascii="Times New Roman" w:eastAsia="Times New Roman" w:hAnsi="Times New Roman" w:cs="Times New Roman"/>
+          <w:sz w:val="24"/>
+          <w:szCs w:val="24"/>
+        </w:rPr>
+        <w:t>Прийдіте</w:t>
+      </w:r>
+      <w:proofErr w:type="spellEnd"/>
+      <w:r>
+        <w:rPr>
+          <w:rFonts w:ascii="Times New Roman" w:eastAsia="Times New Roman" w:hAnsi="Times New Roman" w:cs="Times New Roman"/>
+          <w:sz w:val="24"/>
+          <w:szCs w:val="24"/>
+        </w:rPr>
+        <w:t xml:space="preserve">, всі </w:t>
       </w:r>
       <w:proofErr w:type="spellStart"/>
       <w:r>
@@ -13808,7 +14024,25 @@
           <w:sz w:val="24"/>
           <w:szCs w:val="24"/>
         </w:rPr>
-        <w:t xml:space="preserve"> і Христові предстоїть,* за нас постійно молячи Його.</w:t>
+        <w:t xml:space="preserve"> і Христові </w:t>
+      </w:r>
+      <w:proofErr w:type="spellStart"/>
+      <w:r>
+        <w:rPr>
+          <w:rFonts w:ascii="Times New Roman" w:eastAsia="Times New Roman" w:hAnsi="Times New Roman" w:cs="Times New Roman"/>
+          <w:sz w:val="24"/>
+          <w:szCs w:val="24"/>
+        </w:rPr>
+        <w:t>предстоїть</w:t>
+      </w:r>
+      <w:proofErr w:type="spellEnd"/>
+      <w:r>
+        <w:rPr>
+          <w:rFonts w:ascii="Times New Roman" w:eastAsia="Times New Roman" w:hAnsi="Times New Roman" w:cs="Times New Roman"/>
+          <w:sz w:val="24"/>
+          <w:szCs w:val="24"/>
+        </w:rPr>
+        <w:t>,* за нас постійно молячи Його.</w:t>
       </w:r>
     </w:p>
     <w:p>
@@ -17694,6 +17928,31 @@
     </w:p>
     <w:p>
       <w:pPr>
+        <w:spacing w:before="240" w:after="240" w:line="240" w:lineRule="auto"/>
+        <w:jc w:val="both"/>
+        <w:rPr>
+          <w:rFonts w:ascii="Times New Roman" w:eastAsia="Times New Roman" w:hAnsi="Times New Roman" w:cs="Times New Roman"/>
+          <w:i/>
+          <w:color w:val="FF0000"/>
+          <w:sz w:val="28"/>
+          <w:szCs w:val="28"/>
+          <w:highlight w:val="white"/>
+        </w:rPr>
+      </w:pPr>
+      <w:r>
+        <w:rPr>
+          <w:rFonts w:ascii="Times New Roman" w:eastAsia="Times New Roman" w:hAnsi="Times New Roman" w:cs="Times New Roman"/>
+          <w:i/>
+          <w:color w:val="FF0000"/>
+          <w:sz w:val="28"/>
+          <w:szCs w:val="28"/>
+          <w:highlight w:val="white"/>
+        </w:rPr>
+        <w:t>Стихири благочестивого царя.</w:t>
+      </w:r>
+    </w:p>
+    <w:p>
+      <w:pPr>
         <w:spacing w:after="120" w:line="240" w:lineRule="auto"/>
         <w:jc w:val="both"/>
         <w:rPr>
@@ -17712,76 +17971,16 @@
           <w:szCs w:val="24"/>
           <w:highlight w:val="white"/>
         </w:rPr>
-        <w:t>(г. 4, подібний: Як хороброго):</w:t>
-      </w:r>
-      <w:r>
-        <w:rPr>
-          <w:rFonts w:ascii="Times New Roman" w:eastAsia="Times New Roman" w:hAnsi="Times New Roman" w:cs="Times New Roman"/>
-          <w:sz w:val="24"/>
-          <w:szCs w:val="24"/>
-          <w:highlight w:val="white"/>
-        </w:rPr>
-        <w:t xml:space="preserve"> На очах божественних Твоїх учнів* вознісся Ти на небеса* і </w:t>
-      </w:r>
-      <w:proofErr w:type="spellStart"/>
-      <w:r>
-        <w:rPr>
-          <w:rFonts w:ascii="Times New Roman" w:eastAsia="Times New Roman" w:hAnsi="Times New Roman" w:cs="Times New Roman"/>
-          <w:sz w:val="24"/>
-          <w:szCs w:val="24"/>
-          <w:highlight w:val="white"/>
-        </w:rPr>
-        <w:t>возсів</w:t>
-      </w:r>
-      <w:proofErr w:type="spellEnd"/>
-      <w:r>
-        <w:rPr>
-          <w:rFonts w:ascii="Times New Roman" w:eastAsia="Times New Roman" w:hAnsi="Times New Roman" w:cs="Times New Roman"/>
-          <w:sz w:val="24"/>
-          <w:szCs w:val="24"/>
-          <w:highlight w:val="white"/>
-        </w:rPr>
-        <w:t xml:space="preserve"> праворуч Родителя,* нерозлучний Його </w:t>
-      </w:r>
-      <w:proofErr w:type="spellStart"/>
-      <w:r>
-        <w:rPr>
-          <w:rFonts w:ascii="Times New Roman" w:eastAsia="Times New Roman" w:hAnsi="Times New Roman" w:cs="Times New Roman"/>
-          <w:sz w:val="24"/>
-          <w:szCs w:val="24"/>
-          <w:highlight w:val="white"/>
-        </w:rPr>
-        <w:t>понадсущний</w:t>
-      </w:r>
-      <w:proofErr w:type="spellEnd"/>
-      <w:r>
-        <w:rPr>
-          <w:rFonts w:ascii="Times New Roman" w:eastAsia="Times New Roman" w:hAnsi="Times New Roman" w:cs="Times New Roman"/>
-          <w:sz w:val="24"/>
-          <w:szCs w:val="24"/>
-          <w:highlight w:val="white"/>
-        </w:rPr>
-        <w:t xml:space="preserve"> Сину,* і як мовив, послав єси Утішителя,* що чинив небесними,* мудрими, і </w:t>
-      </w:r>
-      <w:proofErr w:type="spellStart"/>
-      <w:r>
-        <w:rPr>
-          <w:rFonts w:ascii="Times New Roman" w:eastAsia="Times New Roman" w:hAnsi="Times New Roman" w:cs="Times New Roman"/>
-          <w:sz w:val="24"/>
-          <w:szCs w:val="24"/>
-          <w:highlight w:val="white"/>
-        </w:rPr>
-        <w:t>богомовними</w:t>
-      </w:r>
-      <w:proofErr w:type="spellEnd"/>
-      <w:r>
-        <w:rPr>
-          <w:rFonts w:ascii="Times New Roman" w:eastAsia="Times New Roman" w:hAnsi="Times New Roman" w:cs="Times New Roman"/>
-          <w:sz w:val="24"/>
-          <w:szCs w:val="24"/>
-          <w:highlight w:val="white"/>
-        </w:rPr>
-        <w:t>,* і священними – земних* Апостолів Твоїх.</w:t>
+        <w:t xml:space="preserve">(г. 4, подібний: Дав Ти як знамено): </w:t>
+      </w:r>
+      <w:r>
+        <w:rPr>
+          <w:rFonts w:ascii="Times New Roman" w:eastAsia="Times New Roman" w:hAnsi="Times New Roman" w:cs="Times New Roman"/>
+          <w:sz w:val="24"/>
+          <w:szCs w:val="24"/>
+          <w:highlight w:val="white"/>
+        </w:rPr>
+        <w:t>Зброю наймогутнішу* цареві нашому дав Ти* – Хрест Твій чесний,* щоб ним царював він на землі справедливо,* сяючи благочестям,* і Царства Небесного удостоївся з милосердя Твого;* з ним Твій чоловіколюбний Промисел славимо,* Ісусе всесильний,* Спасе душ наших.</w:t>
       </w:r>
     </w:p>
     <w:p>
@@ -17802,47 +18001,7 @@
           <w:szCs w:val="24"/>
           <w:highlight w:val="white"/>
         </w:rPr>
-        <w:t xml:space="preserve">З невимовної благости* воплотився Ти, Ісусе,* і хрест і смерть, Безсмертний,* </w:t>
-      </w:r>
-      <w:proofErr w:type="spellStart"/>
-      <w:r>
-        <w:rPr>
-          <w:rFonts w:ascii="Times New Roman" w:eastAsia="Times New Roman" w:hAnsi="Times New Roman" w:cs="Times New Roman"/>
-          <w:sz w:val="24"/>
-          <w:szCs w:val="24"/>
-          <w:highlight w:val="white"/>
-        </w:rPr>
-        <w:t>власновільно</w:t>
-      </w:r>
-      <w:proofErr w:type="spellEnd"/>
-      <w:r>
-        <w:rPr>
-          <w:rFonts w:ascii="Times New Roman" w:eastAsia="Times New Roman" w:hAnsi="Times New Roman" w:cs="Times New Roman"/>
-          <w:sz w:val="24"/>
-          <w:szCs w:val="24"/>
-          <w:highlight w:val="white"/>
-        </w:rPr>
-        <w:t xml:space="preserve"> перетерпів,* і опісля на третій день воскрес із мертвих,* по сорока днях вознісся* туди, звідки перше зійшов єси,* умиротворивши земне* і всіх </w:t>
-      </w:r>
-      <w:proofErr w:type="spellStart"/>
-      <w:r>
-        <w:rPr>
-          <w:rFonts w:ascii="Times New Roman" w:eastAsia="Times New Roman" w:hAnsi="Times New Roman" w:cs="Times New Roman"/>
-          <w:sz w:val="24"/>
-          <w:szCs w:val="24"/>
-          <w:highlight w:val="white"/>
-        </w:rPr>
-        <w:t>привівши</w:t>
-      </w:r>
-      <w:proofErr w:type="spellEnd"/>
-      <w:r>
-        <w:rPr>
-          <w:rFonts w:ascii="Times New Roman" w:eastAsia="Times New Roman" w:hAnsi="Times New Roman" w:cs="Times New Roman"/>
-          <w:sz w:val="24"/>
-          <w:szCs w:val="24"/>
-          <w:highlight w:val="white"/>
-        </w:rPr>
-        <w:t xml:space="preserve"> до Родителя.</w:t>
+        <w:t>Дав Ти, Чоловіколюбче,* благочестивому Твоєму угодникові* Соломонову мудрість,* Давидову смиренність* і апостольське православ’я,* як царів Цар, владарюючих усіх Владар.* Тим-то Твій чоловіколюбний Промисел славимо,* Ісусе всесильний,* Спасе душ наших.</w:t>
       </w:r>
     </w:p>
     <w:p>
@@ -17863,47 +18022,177 @@
           <w:szCs w:val="24"/>
           <w:highlight w:val="white"/>
         </w:rPr>
-        <w:t xml:space="preserve">Як побачили піднятого* на хмарах Тебе, Господи, мудрі Апостоли,* то, повні горя і пригнічення,* взивали зі сльозами:* «Не залишай сиротами* тих, кого з милосердя возлюбив єси,* але </w:t>
-      </w:r>
-      <w:proofErr w:type="spellStart"/>
-      <w:r>
-        <w:rPr>
-          <w:rFonts w:ascii="Times New Roman" w:eastAsia="Times New Roman" w:hAnsi="Times New Roman" w:cs="Times New Roman"/>
-          <w:sz w:val="24"/>
-          <w:szCs w:val="24"/>
-          <w:highlight w:val="white"/>
-        </w:rPr>
-        <w:t>пошли</w:t>
-      </w:r>
-      <w:proofErr w:type="spellEnd"/>
-      <w:r>
-        <w:rPr>
-          <w:rFonts w:ascii="Times New Roman" w:eastAsia="Times New Roman" w:hAnsi="Times New Roman" w:cs="Times New Roman"/>
-          <w:sz w:val="24"/>
-          <w:szCs w:val="24"/>
-          <w:highlight w:val="white"/>
-        </w:rPr>
-        <w:t xml:space="preserve"> на нас, як обіцяв Ти, </w:t>
-      </w:r>
-      <w:proofErr w:type="spellStart"/>
-      <w:r>
-        <w:rPr>
-          <w:rFonts w:ascii="Times New Roman" w:eastAsia="Times New Roman" w:hAnsi="Times New Roman" w:cs="Times New Roman"/>
-          <w:sz w:val="24"/>
-          <w:szCs w:val="24"/>
-          <w:highlight w:val="white"/>
-        </w:rPr>
-        <w:t>Всещедрий</w:t>
-      </w:r>
-      <w:proofErr w:type="spellEnd"/>
-      <w:r>
-        <w:rPr>
-          <w:rFonts w:ascii="Times New Roman" w:eastAsia="Times New Roman" w:hAnsi="Times New Roman" w:cs="Times New Roman"/>
-          <w:sz w:val="24"/>
-          <w:szCs w:val="24"/>
-          <w:highlight w:val="white"/>
-        </w:rPr>
-        <w:t>,* Пресвятого Твого Духа* – Просвітителя душам нашим!»</w:t>
+        <w:t xml:space="preserve">Перший добровільно,* приснопам’ятний царю,* простелив ти багряницю Христові,* в Ньому пізнавши Бога і </w:t>
+      </w:r>
+      <w:proofErr w:type="spellStart"/>
+      <w:r>
+        <w:rPr>
+          <w:rFonts w:ascii="Times New Roman" w:eastAsia="Times New Roman" w:hAnsi="Times New Roman" w:cs="Times New Roman"/>
+          <w:sz w:val="24"/>
+          <w:szCs w:val="24"/>
+          <w:highlight w:val="white"/>
+        </w:rPr>
+        <w:t>Всецаря</w:t>
+      </w:r>
+      <w:proofErr w:type="spellEnd"/>
+      <w:r>
+        <w:rPr>
+          <w:rFonts w:ascii="Times New Roman" w:eastAsia="Times New Roman" w:hAnsi="Times New Roman" w:cs="Times New Roman"/>
+          <w:sz w:val="24"/>
+          <w:szCs w:val="24"/>
+          <w:highlight w:val="white"/>
+        </w:rPr>
+        <w:t xml:space="preserve">, всіх Доброчинця,* що над усяким началом здобуває перемогу* і всяку владу перевищує.* Через це тобі, </w:t>
+      </w:r>
+      <w:proofErr w:type="spellStart"/>
+      <w:r>
+        <w:rPr>
+          <w:rFonts w:ascii="Times New Roman" w:eastAsia="Times New Roman" w:hAnsi="Times New Roman" w:cs="Times New Roman"/>
+          <w:sz w:val="24"/>
+          <w:szCs w:val="24"/>
+          <w:highlight w:val="white"/>
+        </w:rPr>
+        <w:t>Христолюбче</w:t>
+      </w:r>
+      <w:proofErr w:type="spellEnd"/>
+      <w:r>
+        <w:rPr>
+          <w:rFonts w:ascii="Times New Roman" w:eastAsia="Times New Roman" w:hAnsi="Times New Roman" w:cs="Times New Roman"/>
+          <w:sz w:val="24"/>
+          <w:szCs w:val="24"/>
+          <w:highlight w:val="white"/>
+        </w:rPr>
+        <w:t>,* царство справив Ісус, Чоловіколюбець* і Спас душ наших.</w:t>
+      </w:r>
+    </w:p>
+    <w:p>
+      <w:pPr>
+        <w:spacing w:after="120" w:line="240" w:lineRule="auto"/>
+        <w:jc w:val="both"/>
+        <w:rPr>
+          <w:rFonts w:ascii="Times New Roman" w:eastAsia="Times New Roman" w:hAnsi="Times New Roman" w:cs="Times New Roman"/>
+          <w:sz w:val="24"/>
+          <w:szCs w:val="24"/>
+          <w:highlight w:val="white"/>
+        </w:rPr>
+      </w:pPr>
+      <w:r>
+        <w:rPr>
+          <w:rFonts w:ascii="Times New Roman" w:eastAsia="Times New Roman" w:hAnsi="Times New Roman" w:cs="Times New Roman"/>
+          <w:b/>
+          <w:sz w:val="24"/>
+          <w:szCs w:val="24"/>
+          <w:highlight w:val="white"/>
+        </w:rPr>
+        <w:t>Слава:</w:t>
+      </w:r>
+      <w:r>
+        <w:rPr>
+          <w:rFonts w:ascii="Times New Roman" w:eastAsia="Times New Roman" w:hAnsi="Times New Roman" w:cs="Times New Roman"/>
+          <w:i/>
+          <w:color w:val="FF0000"/>
+          <w:sz w:val="24"/>
+          <w:szCs w:val="24"/>
+          <w:highlight w:val="white"/>
+        </w:rPr>
+        <w:t xml:space="preserve"> (г. 2): </w:t>
+      </w:r>
+      <w:r>
+        <w:rPr>
+          <w:rFonts w:ascii="Times New Roman" w:eastAsia="Times New Roman" w:hAnsi="Times New Roman" w:cs="Times New Roman"/>
+          <w:sz w:val="24"/>
+          <w:szCs w:val="24"/>
+          <w:highlight w:val="white"/>
+        </w:rPr>
+        <w:t xml:space="preserve">З багатства дарів найкращі прийнявши від Бога,* царю можновладний,* </w:t>
+      </w:r>
+      <w:proofErr w:type="spellStart"/>
+      <w:r>
+        <w:rPr>
+          <w:rFonts w:ascii="Times New Roman" w:eastAsia="Times New Roman" w:hAnsi="Times New Roman" w:cs="Times New Roman"/>
+          <w:sz w:val="24"/>
+          <w:szCs w:val="24"/>
+          <w:highlight w:val="white"/>
+        </w:rPr>
+        <w:t>Константине</w:t>
+      </w:r>
+      <w:proofErr w:type="spellEnd"/>
+      <w:r>
+        <w:rPr>
+          <w:rFonts w:ascii="Times New Roman" w:eastAsia="Times New Roman" w:hAnsi="Times New Roman" w:cs="Times New Roman"/>
+          <w:sz w:val="24"/>
+          <w:szCs w:val="24"/>
+          <w:highlight w:val="white"/>
+        </w:rPr>
+        <w:t xml:space="preserve"> превеликий,* ти в них добре успіху досяг:* бо осяяний променями </w:t>
+      </w:r>
+      <w:proofErr w:type="spellStart"/>
+      <w:r>
+        <w:rPr>
+          <w:rFonts w:ascii="Times New Roman" w:eastAsia="Times New Roman" w:hAnsi="Times New Roman" w:cs="Times New Roman"/>
+          <w:sz w:val="24"/>
+          <w:szCs w:val="24"/>
+          <w:highlight w:val="white"/>
+        </w:rPr>
+        <w:t>Всесвятого</w:t>
+      </w:r>
+      <w:proofErr w:type="spellEnd"/>
+      <w:r>
+        <w:rPr>
+          <w:rFonts w:ascii="Times New Roman" w:eastAsia="Times New Roman" w:hAnsi="Times New Roman" w:cs="Times New Roman"/>
+          <w:sz w:val="24"/>
+          <w:szCs w:val="24"/>
+          <w:highlight w:val="white"/>
+        </w:rPr>
+        <w:t xml:space="preserve"> Духа* завдяки святителю Сильвестрові,* серед царів явився ти непереможним,* вселенну дав єси як дар Сотворителеві твоєму* і царюючий град благочестивий.* Тим-то, маючи сміливість,* хоч лише на смертному одрі охрещений,* не переставай благати Христа Бога* дарувати всім, що творять пам’ять твою, гріхів прощення* і велику милість.</w:t>
+      </w:r>
+    </w:p>
+    <w:p>
+      <w:pPr>
+        <w:spacing w:before="240" w:after="240" w:line="240" w:lineRule="auto"/>
+        <w:rPr>
+          <w:rFonts w:ascii="Times New Roman" w:eastAsia="Times New Roman" w:hAnsi="Times New Roman" w:cs="Times New Roman"/>
+          <w:b/>
+          <w:color w:val="FF0000"/>
+          <w:sz w:val="24"/>
+          <w:szCs w:val="24"/>
+          <w:highlight w:val="white"/>
+        </w:rPr>
+      </w:pPr>
+      <w:r>
+        <w:rPr>
+          <w:rFonts w:ascii="Times New Roman" w:eastAsia="Times New Roman" w:hAnsi="Times New Roman" w:cs="Times New Roman"/>
+          <w:b/>
+          <w:color w:val="FF0000"/>
+          <w:sz w:val="24"/>
+          <w:szCs w:val="24"/>
+          <w:highlight w:val="white"/>
+        </w:rPr>
+        <w:t xml:space="preserve">Стихири на </w:t>
+      </w:r>
+      <w:proofErr w:type="spellStart"/>
+      <w:r>
+        <w:rPr>
+          <w:rFonts w:ascii="Times New Roman" w:eastAsia="Times New Roman" w:hAnsi="Times New Roman" w:cs="Times New Roman"/>
+          <w:b/>
+          <w:color w:val="FF0000"/>
+          <w:sz w:val="24"/>
+          <w:szCs w:val="24"/>
+          <w:highlight w:val="white"/>
+        </w:rPr>
+        <w:t>литії</w:t>
+      </w:r>
+      <w:proofErr w:type="spellEnd"/>
+      <w:r>
+        <w:rPr>
+          <w:rFonts w:ascii="Times New Roman" w:eastAsia="Times New Roman" w:hAnsi="Times New Roman" w:cs="Times New Roman"/>
+          <w:b/>
+          <w:color w:val="FF0000"/>
+          <w:sz w:val="24"/>
+          <w:szCs w:val="24"/>
+          <w:highlight w:val="white"/>
+        </w:rPr>
+        <w:t>:</w:t>
       </w:r>
     </w:p>
     <w:p>
@@ -17912,10 +18201,141 @@
         <w:jc w:val="both"/>
         <w:rPr>
           <w:rFonts w:ascii="Times New Roman" w:eastAsia="Times New Roman" w:hAnsi="Times New Roman" w:cs="Times New Roman"/>
+          <w:sz w:val="24"/>
+          <w:szCs w:val="24"/>
+          <w:highlight w:val="white"/>
+        </w:rPr>
+      </w:pPr>
+      <w:r>
+        <w:rPr>
+          <w:rFonts w:ascii="Times New Roman" w:eastAsia="Times New Roman" w:hAnsi="Times New Roman" w:cs="Times New Roman"/>
           <w:i/>
           <w:color w:val="FF0000"/>
-          <w:sz w:val="28"/>
-          <w:szCs w:val="28"/>
+          <w:sz w:val="24"/>
+          <w:szCs w:val="24"/>
+          <w:highlight w:val="white"/>
+        </w:rPr>
+        <w:lastRenderedPageBreak/>
+        <w:t>(г. 1):</w:t>
+      </w:r>
+      <w:r>
+        <w:rPr>
+          <w:rFonts w:ascii="Times New Roman" w:eastAsia="Times New Roman" w:hAnsi="Times New Roman" w:cs="Times New Roman"/>
+          <w:sz w:val="24"/>
+          <w:szCs w:val="24"/>
+          <w:highlight w:val="white"/>
+        </w:rPr>
+        <w:t xml:space="preserve"> Як </w:t>
+      </w:r>
+      <w:proofErr w:type="spellStart"/>
+      <w:r>
+        <w:rPr>
+          <w:rFonts w:ascii="Times New Roman" w:eastAsia="Times New Roman" w:hAnsi="Times New Roman" w:cs="Times New Roman"/>
+          <w:sz w:val="24"/>
+          <w:szCs w:val="24"/>
+          <w:highlight w:val="white"/>
+        </w:rPr>
+        <w:t>довг</w:t>
+      </w:r>
+      <w:proofErr w:type="spellEnd"/>
+      <w:r>
+        <w:rPr>
+          <w:rFonts w:ascii="Times New Roman" w:eastAsia="Times New Roman" w:hAnsi="Times New Roman" w:cs="Times New Roman"/>
+          <w:sz w:val="24"/>
+          <w:szCs w:val="24"/>
+          <w:highlight w:val="white"/>
+        </w:rPr>
+        <w:t xml:space="preserve"> велить, звершуємо пам’ять твою, </w:t>
+      </w:r>
+      <w:proofErr w:type="spellStart"/>
+      <w:r>
+        <w:rPr>
+          <w:rFonts w:ascii="Times New Roman" w:eastAsia="Times New Roman" w:hAnsi="Times New Roman" w:cs="Times New Roman"/>
+          <w:sz w:val="24"/>
+          <w:szCs w:val="24"/>
+          <w:highlight w:val="white"/>
+        </w:rPr>
+        <w:t>Константине</w:t>
+      </w:r>
+      <w:proofErr w:type="spellEnd"/>
+      <w:r>
+        <w:rPr>
+          <w:rFonts w:ascii="Times New Roman" w:eastAsia="Times New Roman" w:hAnsi="Times New Roman" w:cs="Times New Roman"/>
+          <w:sz w:val="24"/>
+          <w:szCs w:val="24"/>
+          <w:highlight w:val="white"/>
+        </w:rPr>
+        <w:t xml:space="preserve"> рівноапостольний,* всіх царів підвалино і похвало;* бо, бувши просвічений променями Духа,* ти світлом звеселив усю Церкву Христову,* собори вірних звідусіль зібравши у світлому граді </w:t>
+      </w:r>
+      <w:proofErr w:type="spellStart"/>
+      <w:r>
+        <w:rPr>
+          <w:rFonts w:ascii="Times New Roman" w:eastAsia="Times New Roman" w:hAnsi="Times New Roman" w:cs="Times New Roman"/>
+          <w:sz w:val="24"/>
+          <w:szCs w:val="24"/>
+          <w:highlight w:val="white"/>
+        </w:rPr>
+        <w:t>Нікейському</w:t>
+      </w:r>
+      <w:proofErr w:type="spellEnd"/>
+      <w:r>
+        <w:rPr>
+          <w:rFonts w:ascii="Times New Roman" w:eastAsia="Times New Roman" w:hAnsi="Times New Roman" w:cs="Times New Roman"/>
+          <w:sz w:val="24"/>
+          <w:szCs w:val="24"/>
+          <w:highlight w:val="white"/>
+        </w:rPr>
+        <w:t xml:space="preserve">,* де </w:t>
+      </w:r>
+      <w:proofErr w:type="spellStart"/>
+      <w:r>
+        <w:rPr>
+          <w:rFonts w:ascii="Times New Roman" w:eastAsia="Times New Roman" w:hAnsi="Times New Roman" w:cs="Times New Roman"/>
+          <w:sz w:val="24"/>
+          <w:szCs w:val="24"/>
+          <w:highlight w:val="white"/>
+        </w:rPr>
+        <w:t>згасилося</w:t>
+      </w:r>
+      <w:proofErr w:type="spellEnd"/>
+      <w:r>
+        <w:rPr>
+          <w:rFonts w:ascii="Times New Roman" w:eastAsia="Times New Roman" w:hAnsi="Times New Roman" w:cs="Times New Roman"/>
+          <w:sz w:val="24"/>
+          <w:szCs w:val="24"/>
+          <w:highlight w:val="white"/>
+        </w:rPr>
+        <w:t xml:space="preserve"> зухвальство злочестивих* і знемогли та знавісніли єретичні язики,* православних же вознісся вінець,* коли явилася їх віра.* Звідти від них прославився </w:t>
+      </w:r>
+      <w:proofErr w:type="spellStart"/>
+      <w:r>
+        <w:rPr>
+          <w:rFonts w:ascii="Times New Roman" w:eastAsia="Times New Roman" w:hAnsi="Times New Roman" w:cs="Times New Roman"/>
+          <w:sz w:val="24"/>
+          <w:szCs w:val="24"/>
+          <w:highlight w:val="white"/>
+        </w:rPr>
+        <w:t>всеправославний</w:t>
+      </w:r>
+      <w:proofErr w:type="spellEnd"/>
+      <w:r>
+        <w:rPr>
+          <w:rFonts w:ascii="Times New Roman" w:eastAsia="Times New Roman" w:hAnsi="Times New Roman" w:cs="Times New Roman"/>
+          <w:sz w:val="24"/>
+          <w:szCs w:val="24"/>
+          <w:highlight w:val="white"/>
+        </w:rPr>
+        <w:t>* і всім царям був проголошений як отець* ти, що перший багряницю від Бога прийняв.* Тому просимо тебе ми, що звершуємо пам’ять твою вірно:* випроси очищення гріхів для душ наших!</w:t>
+      </w:r>
+    </w:p>
+    <w:p>
+      <w:pPr>
+        <w:spacing w:before="240" w:after="240" w:line="240" w:lineRule="auto"/>
+        <w:jc w:val="both"/>
+        <w:rPr>
+          <w:rFonts w:ascii="Times New Roman" w:eastAsia="Times New Roman" w:hAnsi="Times New Roman" w:cs="Times New Roman"/>
+          <w:sz w:val="24"/>
+          <w:szCs w:val="24"/>
           <w:highlight w:val="white"/>
         </w:rPr>
       </w:pPr>
@@ -17924,11 +18344,265 @@
           <w:rFonts w:ascii="Times New Roman" w:eastAsia="Times New Roman" w:hAnsi="Times New Roman" w:cs="Times New Roman"/>
           <w:i/>
           <w:color w:val="FF0000"/>
-          <w:sz w:val="28"/>
-          <w:szCs w:val="28"/>
-          <w:highlight w:val="white"/>
-        </w:rPr>
-        <w:t>Стихири благочестивого царя.</w:t>
+          <w:sz w:val="24"/>
+          <w:szCs w:val="24"/>
+          <w:highlight w:val="white"/>
+        </w:rPr>
+        <w:t xml:space="preserve">(г. 2): </w:t>
+      </w:r>
+      <w:r>
+        <w:rPr>
+          <w:rFonts w:ascii="Times New Roman" w:eastAsia="Times New Roman" w:hAnsi="Times New Roman" w:cs="Times New Roman"/>
+          <w:sz w:val="24"/>
+          <w:szCs w:val="24"/>
+          <w:highlight w:val="white"/>
+        </w:rPr>
+        <w:t xml:space="preserve">Не від людей звання прийняв ти,* але, як богонатхненний Павло,* мав його радше з висоти, преславний </w:t>
+      </w:r>
+      <w:proofErr w:type="spellStart"/>
+      <w:r>
+        <w:rPr>
+          <w:rFonts w:ascii="Times New Roman" w:eastAsia="Times New Roman" w:hAnsi="Times New Roman" w:cs="Times New Roman"/>
+          <w:sz w:val="24"/>
+          <w:szCs w:val="24"/>
+          <w:highlight w:val="white"/>
+        </w:rPr>
+        <w:t>Константине</w:t>
+      </w:r>
+      <w:proofErr w:type="spellEnd"/>
+      <w:r>
+        <w:rPr>
+          <w:rFonts w:ascii="Times New Roman" w:eastAsia="Times New Roman" w:hAnsi="Times New Roman" w:cs="Times New Roman"/>
+          <w:sz w:val="24"/>
+          <w:szCs w:val="24"/>
+          <w:highlight w:val="white"/>
+        </w:rPr>
+        <w:t xml:space="preserve"> рівноапостольний,* від Христа Бога.* Бо знамення Хреста на небі видівши,* ним був ти уловлений, як найкращий улов,* у ньому і переможцем нездоланним* проти видимих і невидимих ворогів ти явився.* Тим-то молимо тебе як гарячого заступника* ми, земні, достойно пам’ять твою почитаючи,* у дерзновенні випросити нам просвічення, очищення* і великої милости.</w:t>
+      </w:r>
+    </w:p>
+    <w:p>
+      <w:pPr>
+        <w:spacing w:before="240" w:after="240" w:line="240" w:lineRule="auto"/>
+        <w:jc w:val="both"/>
+        <w:rPr>
+          <w:rFonts w:ascii="Times New Roman" w:eastAsia="Times New Roman" w:hAnsi="Times New Roman" w:cs="Times New Roman"/>
+          <w:sz w:val="24"/>
+          <w:szCs w:val="24"/>
+          <w:highlight w:val="white"/>
+        </w:rPr>
+      </w:pPr>
+      <w:r>
+        <w:rPr>
+          <w:rFonts w:ascii="Times New Roman" w:eastAsia="Times New Roman" w:hAnsi="Times New Roman" w:cs="Times New Roman"/>
+          <w:sz w:val="24"/>
+          <w:szCs w:val="24"/>
+          <w:highlight w:val="white"/>
+        </w:rPr>
+        <w:t xml:space="preserve">Благочестивого Константина пам’ять, як миро </w:t>
+      </w:r>
+      <w:proofErr w:type="spellStart"/>
+      <w:r>
+        <w:rPr>
+          <w:rFonts w:ascii="Times New Roman" w:eastAsia="Times New Roman" w:hAnsi="Times New Roman" w:cs="Times New Roman"/>
+          <w:sz w:val="24"/>
+          <w:szCs w:val="24"/>
+          <w:highlight w:val="white"/>
+        </w:rPr>
+        <w:t>вичерпуване</w:t>
+      </w:r>
+      <w:proofErr w:type="spellEnd"/>
+      <w:r>
+        <w:rPr>
+          <w:rFonts w:ascii="Times New Roman" w:eastAsia="Times New Roman" w:hAnsi="Times New Roman" w:cs="Times New Roman"/>
+          <w:sz w:val="24"/>
+          <w:szCs w:val="24"/>
+          <w:highlight w:val="white"/>
+        </w:rPr>
+        <w:t xml:space="preserve"> </w:t>
+      </w:r>
+      <w:proofErr w:type="spellStart"/>
+      <w:r>
+        <w:rPr>
+          <w:rFonts w:ascii="Times New Roman" w:eastAsia="Times New Roman" w:hAnsi="Times New Roman" w:cs="Times New Roman"/>
+          <w:sz w:val="24"/>
+          <w:szCs w:val="24"/>
+          <w:highlight w:val="white"/>
+        </w:rPr>
+        <w:t>днесь</w:t>
+      </w:r>
+      <w:proofErr w:type="spellEnd"/>
+      <w:r>
+        <w:rPr>
+          <w:rFonts w:ascii="Times New Roman" w:eastAsia="Times New Roman" w:hAnsi="Times New Roman" w:cs="Times New Roman"/>
+          <w:sz w:val="24"/>
+          <w:szCs w:val="24"/>
+          <w:highlight w:val="white"/>
+        </w:rPr>
+        <w:t xml:space="preserve"> </w:t>
+      </w:r>
+      <w:proofErr w:type="spellStart"/>
+      <w:r>
+        <w:rPr>
+          <w:rFonts w:ascii="Times New Roman" w:eastAsia="Times New Roman" w:hAnsi="Times New Roman" w:cs="Times New Roman"/>
+          <w:sz w:val="24"/>
+          <w:szCs w:val="24"/>
+          <w:highlight w:val="white"/>
+        </w:rPr>
+        <w:t>возсіяла</w:t>
+      </w:r>
+      <w:proofErr w:type="spellEnd"/>
+      <w:r>
+        <w:rPr>
+          <w:rFonts w:ascii="Times New Roman" w:eastAsia="Times New Roman" w:hAnsi="Times New Roman" w:cs="Times New Roman"/>
+          <w:sz w:val="24"/>
+          <w:szCs w:val="24"/>
+          <w:highlight w:val="white"/>
+        </w:rPr>
+        <w:t>:* Христа бо жадаючи, він ідолів знехтував,* храм воздвиг на землі Розп’ятому нас ради,* на небесах же отримав у нагороду надії вінець.</w:t>
+      </w:r>
+    </w:p>
+    <w:p>
+      <w:pPr>
+        <w:spacing w:before="240" w:after="240" w:line="240" w:lineRule="auto"/>
+        <w:jc w:val="both"/>
+        <w:rPr>
+          <w:rFonts w:ascii="Times New Roman" w:eastAsia="Times New Roman" w:hAnsi="Times New Roman" w:cs="Times New Roman"/>
+          <w:sz w:val="24"/>
+          <w:szCs w:val="24"/>
+          <w:highlight w:val="white"/>
+        </w:rPr>
+      </w:pPr>
+      <w:r>
+        <w:rPr>
+          <w:rFonts w:ascii="Times New Roman" w:eastAsia="Times New Roman" w:hAnsi="Times New Roman" w:cs="Times New Roman"/>
+          <w:i/>
+          <w:color w:val="FF0000"/>
+          <w:sz w:val="24"/>
+          <w:szCs w:val="24"/>
+          <w:highlight w:val="white"/>
+        </w:rPr>
+        <w:t xml:space="preserve">(г. 3): </w:t>
+      </w:r>
+      <w:r>
+        <w:rPr>
+          <w:rFonts w:ascii="Times New Roman" w:eastAsia="Times New Roman" w:hAnsi="Times New Roman" w:cs="Times New Roman"/>
+          <w:sz w:val="24"/>
+          <w:szCs w:val="24"/>
+          <w:highlight w:val="white"/>
+        </w:rPr>
+        <w:t xml:space="preserve">Юначий вік проходячи,* неначе богонатхненний Павло,* ти з висот прийняв божественну харизму;* і рать лютого войовника всеозброєнням Хреста повергнув,* царів похвало, </w:t>
+      </w:r>
+      <w:proofErr w:type="spellStart"/>
+      <w:r>
+        <w:rPr>
+          <w:rFonts w:ascii="Times New Roman" w:eastAsia="Times New Roman" w:hAnsi="Times New Roman" w:cs="Times New Roman"/>
+          <w:sz w:val="24"/>
+          <w:szCs w:val="24"/>
+          <w:highlight w:val="white"/>
+        </w:rPr>
+        <w:t>Константине</w:t>
+      </w:r>
+      <w:proofErr w:type="spellEnd"/>
+      <w:r>
+        <w:rPr>
+          <w:rFonts w:ascii="Times New Roman" w:eastAsia="Times New Roman" w:hAnsi="Times New Roman" w:cs="Times New Roman"/>
+          <w:sz w:val="24"/>
+          <w:szCs w:val="24"/>
+          <w:highlight w:val="white"/>
+        </w:rPr>
+        <w:t xml:space="preserve"> рівноапостольний,* за нас Господа моли,* щоб спаслися душі наші.</w:t>
+      </w:r>
+    </w:p>
+    <w:p>
+      <w:pPr>
+        <w:spacing w:before="240" w:after="240" w:line="240" w:lineRule="auto"/>
+        <w:jc w:val="both"/>
+        <w:rPr>
+          <w:rFonts w:ascii="Times New Roman" w:eastAsia="Times New Roman" w:hAnsi="Times New Roman" w:cs="Times New Roman"/>
+          <w:sz w:val="24"/>
+          <w:szCs w:val="24"/>
+          <w:highlight w:val="white"/>
+        </w:rPr>
+      </w:pPr>
+      <w:r>
+        <w:rPr>
+          <w:rFonts w:ascii="Times New Roman" w:eastAsia="Times New Roman" w:hAnsi="Times New Roman" w:cs="Times New Roman"/>
+          <w:i/>
+          <w:color w:val="FF0000"/>
+          <w:sz w:val="24"/>
+          <w:szCs w:val="24"/>
+          <w:highlight w:val="white"/>
+        </w:rPr>
+        <w:t xml:space="preserve">(г. 4): </w:t>
+      </w:r>
+      <w:r>
+        <w:rPr>
+          <w:rFonts w:ascii="Times New Roman" w:eastAsia="Times New Roman" w:hAnsi="Times New Roman" w:cs="Times New Roman"/>
+          <w:sz w:val="24"/>
+          <w:szCs w:val="24"/>
+          <w:highlight w:val="white"/>
+        </w:rPr>
+        <w:t xml:space="preserve">Хвалу Богові із тлінних уст* оспівує Божественна пам’ять твоя, </w:t>
+      </w:r>
+      <w:proofErr w:type="spellStart"/>
+      <w:r>
+        <w:rPr>
+          <w:rFonts w:ascii="Times New Roman" w:eastAsia="Times New Roman" w:hAnsi="Times New Roman" w:cs="Times New Roman"/>
+          <w:sz w:val="24"/>
+          <w:szCs w:val="24"/>
+          <w:highlight w:val="white"/>
+        </w:rPr>
+        <w:t>Константине</w:t>
+      </w:r>
+      <w:proofErr w:type="spellEnd"/>
+      <w:r>
+        <w:rPr>
+          <w:rFonts w:ascii="Times New Roman" w:eastAsia="Times New Roman" w:hAnsi="Times New Roman" w:cs="Times New Roman"/>
+          <w:sz w:val="24"/>
+          <w:szCs w:val="24"/>
+          <w:highlight w:val="white"/>
+        </w:rPr>
+        <w:t xml:space="preserve"> всехвальний!* Ти бо явився єси прекрасним воїном слова віри,* зневаживши тесані зображення ідолів;* і нині був </w:t>
+      </w:r>
+      <w:proofErr w:type="spellStart"/>
+      <w:r>
+        <w:rPr>
+          <w:rFonts w:ascii="Times New Roman" w:eastAsia="Times New Roman" w:hAnsi="Times New Roman" w:cs="Times New Roman"/>
+          <w:sz w:val="24"/>
+          <w:szCs w:val="24"/>
+          <w:highlight w:val="white"/>
+        </w:rPr>
+        <w:t>причислений</w:t>
+      </w:r>
+      <w:proofErr w:type="spellEnd"/>
+      <w:r>
+        <w:rPr>
+          <w:rFonts w:ascii="Times New Roman" w:eastAsia="Times New Roman" w:hAnsi="Times New Roman" w:cs="Times New Roman"/>
+          <w:sz w:val="24"/>
+          <w:szCs w:val="24"/>
+          <w:highlight w:val="white"/>
+        </w:rPr>
+        <w:t xml:space="preserve"> до Світла Тройці,* ти, що просвічуєш помисли наші </w:t>
+      </w:r>
+      <w:proofErr w:type="spellStart"/>
+      <w:r>
+        <w:rPr>
+          <w:rFonts w:ascii="Times New Roman" w:eastAsia="Times New Roman" w:hAnsi="Times New Roman" w:cs="Times New Roman"/>
+          <w:sz w:val="24"/>
+          <w:szCs w:val="24"/>
+          <w:highlight w:val="white"/>
+        </w:rPr>
+        <w:t>мольбами</w:t>
+      </w:r>
+      <w:proofErr w:type="spellEnd"/>
+      <w:r>
+        <w:rPr>
+          <w:rFonts w:ascii="Times New Roman" w:eastAsia="Times New Roman" w:hAnsi="Times New Roman" w:cs="Times New Roman"/>
+          <w:sz w:val="24"/>
+          <w:szCs w:val="24"/>
+          <w:highlight w:val="white"/>
+        </w:rPr>
+        <w:t xml:space="preserve"> твоїми.</w:t>
       </w:r>
     </w:p>
     <w:p>
@@ -17945,22 +18619,192 @@
       <w:r>
         <w:rPr>
           <w:rFonts w:ascii="Times New Roman" w:eastAsia="Times New Roman" w:hAnsi="Times New Roman" w:cs="Times New Roman"/>
+          <w:b/>
+          <w:sz w:val="24"/>
+          <w:szCs w:val="24"/>
+          <w:highlight w:val="white"/>
+        </w:rPr>
+        <w:t>Слава:</w:t>
+      </w:r>
+      <w:r>
+        <w:rPr>
+          <w:rFonts w:ascii="Times New Roman" w:eastAsia="Times New Roman" w:hAnsi="Times New Roman" w:cs="Times New Roman"/>
           <w:i/>
           <w:color w:val="FF0000"/>
           <w:sz w:val="24"/>
           <w:szCs w:val="24"/>
           <w:highlight w:val="white"/>
         </w:rPr>
-        <w:t xml:space="preserve">(г. 4, подібний: Дав Ти як знамено): </w:t>
-      </w:r>
-      <w:r>
-        <w:rPr>
-          <w:rFonts w:ascii="Times New Roman" w:eastAsia="Times New Roman" w:hAnsi="Times New Roman" w:cs="Times New Roman"/>
-          <w:sz w:val="24"/>
-          <w:szCs w:val="24"/>
-          <w:highlight w:val="white"/>
-        </w:rPr>
-        <w:t>Зброю наймогутнішу* цареві нашому дав Ти* – Хрест Твій чесний,* щоб ним царював він на землі справедливо,* сяючи благочестям,* і Царства Небесного удостоївся з милосердя Твого;* з ним Твій чоловіколюбний Промисел славимо,* Ісусе всесильний,* Спасе душ наших.</w:t>
+        <w:t xml:space="preserve"> (г. 5): </w:t>
+      </w:r>
+      <w:r>
+        <w:rPr>
+          <w:rFonts w:ascii="Times New Roman" w:eastAsia="Times New Roman" w:hAnsi="Times New Roman" w:cs="Times New Roman"/>
+          <w:sz w:val="24"/>
+          <w:szCs w:val="24"/>
+          <w:highlight w:val="white"/>
+        </w:rPr>
+        <w:t xml:space="preserve">Церква,* прикрасившись днесь могутністю твоєю, царю,* таїнственно веселиться* і твою </w:t>
+      </w:r>
+      <w:proofErr w:type="spellStart"/>
+      <w:r>
+        <w:rPr>
+          <w:rFonts w:ascii="Times New Roman" w:eastAsia="Times New Roman" w:hAnsi="Times New Roman" w:cs="Times New Roman"/>
+          <w:sz w:val="24"/>
+          <w:szCs w:val="24"/>
+          <w:highlight w:val="white"/>
+        </w:rPr>
+        <w:t>всечесну</w:t>
+      </w:r>
+      <w:proofErr w:type="spellEnd"/>
+      <w:r>
+        <w:rPr>
+          <w:rFonts w:ascii="Times New Roman" w:eastAsia="Times New Roman" w:hAnsi="Times New Roman" w:cs="Times New Roman"/>
+          <w:sz w:val="24"/>
+          <w:szCs w:val="24"/>
+          <w:highlight w:val="white"/>
+        </w:rPr>
+        <w:t xml:space="preserve"> пам’ять* по достоїнству </w:t>
+      </w:r>
+      <w:proofErr w:type="spellStart"/>
+      <w:r>
+        <w:rPr>
+          <w:rFonts w:ascii="Times New Roman" w:eastAsia="Times New Roman" w:hAnsi="Times New Roman" w:cs="Times New Roman"/>
+          <w:sz w:val="24"/>
+          <w:szCs w:val="24"/>
+          <w:highlight w:val="white"/>
+        </w:rPr>
+        <w:t>прехвально</w:t>
+      </w:r>
+      <w:proofErr w:type="spellEnd"/>
+      <w:r>
+        <w:rPr>
+          <w:rFonts w:ascii="Times New Roman" w:eastAsia="Times New Roman" w:hAnsi="Times New Roman" w:cs="Times New Roman"/>
+          <w:sz w:val="24"/>
+          <w:szCs w:val="24"/>
+          <w:highlight w:val="white"/>
+        </w:rPr>
+        <w:t xml:space="preserve"> вшановує, </w:t>
+      </w:r>
+      <w:proofErr w:type="spellStart"/>
+      <w:r>
+        <w:rPr>
+          <w:rFonts w:ascii="Times New Roman" w:eastAsia="Times New Roman" w:hAnsi="Times New Roman" w:cs="Times New Roman"/>
+          <w:sz w:val="24"/>
+          <w:szCs w:val="24"/>
+          <w:highlight w:val="white"/>
+        </w:rPr>
+        <w:t>кличучи</w:t>
+      </w:r>
+      <w:proofErr w:type="spellEnd"/>
+      <w:r>
+        <w:rPr>
+          <w:rFonts w:ascii="Times New Roman" w:eastAsia="Times New Roman" w:hAnsi="Times New Roman" w:cs="Times New Roman"/>
+          <w:sz w:val="24"/>
+          <w:szCs w:val="24"/>
+          <w:highlight w:val="white"/>
+        </w:rPr>
+        <w:t xml:space="preserve">:* «Радуйся, ти, що Павлові </w:t>
+      </w:r>
+      <w:proofErr w:type="spellStart"/>
+      <w:r>
+        <w:rPr>
+          <w:rFonts w:ascii="Times New Roman" w:eastAsia="Times New Roman" w:hAnsi="Times New Roman" w:cs="Times New Roman"/>
+          <w:sz w:val="24"/>
+          <w:szCs w:val="24"/>
+          <w:highlight w:val="white"/>
+        </w:rPr>
+        <w:t>поревнував</w:t>
+      </w:r>
+      <w:proofErr w:type="spellEnd"/>
+      <w:r>
+        <w:rPr>
+          <w:rFonts w:ascii="Times New Roman" w:eastAsia="Times New Roman" w:hAnsi="Times New Roman" w:cs="Times New Roman"/>
+          <w:sz w:val="24"/>
+          <w:szCs w:val="24"/>
+          <w:highlight w:val="white"/>
+        </w:rPr>
+        <w:t xml:space="preserve">,* і Хрест Христовий узяв,* і тенета розірвав </w:t>
+      </w:r>
+      <w:proofErr w:type="spellStart"/>
+      <w:r>
+        <w:rPr>
+          <w:rFonts w:ascii="Times New Roman" w:eastAsia="Times New Roman" w:hAnsi="Times New Roman" w:cs="Times New Roman"/>
+          <w:sz w:val="24"/>
+          <w:szCs w:val="24"/>
+          <w:highlight w:val="white"/>
+        </w:rPr>
+        <w:t>протиборця</w:t>
+      </w:r>
+      <w:proofErr w:type="spellEnd"/>
+      <w:r>
+        <w:rPr>
+          <w:rFonts w:ascii="Times New Roman" w:eastAsia="Times New Roman" w:hAnsi="Times New Roman" w:cs="Times New Roman"/>
+          <w:sz w:val="24"/>
+          <w:szCs w:val="24"/>
+          <w:highlight w:val="white"/>
+        </w:rPr>
+        <w:t xml:space="preserve">!* Радуйся, з-поміж царів </w:t>
+      </w:r>
+      <w:proofErr w:type="spellStart"/>
+      <w:r>
+        <w:rPr>
+          <w:rFonts w:ascii="Times New Roman" w:eastAsia="Times New Roman" w:hAnsi="Times New Roman" w:cs="Times New Roman"/>
+          <w:sz w:val="24"/>
+          <w:szCs w:val="24"/>
+          <w:highlight w:val="white"/>
+        </w:rPr>
+        <w:t>найособливіший</w:t>
+      </w:r>
+      <w:proofErr w:type="spellEnd"/>
+      <w:r>
+        <w:rPr>
+          <w:rFonts w:ascii="Times New Roman" w:eastAsia="Times New Roman" w:hAnsi="Times New Roman" w:cs="Times New Roman"/>
+          <w:sz w:val="24"/>
+          <w:szCs w:val="24"/>
+          <w:highlight w:val="white"/>
+        </w:rPr>
+        <w:t xml:space="preserve">* і апостолам рівний шаною!* Радуйся, вірних підпоро* і царів передня </w:t>
+      </w:r>
+      <w:proofErr w:type="spellStart"/>
+      <w:r>
+        <w:rPr>
+          <w:rFonts w:ascii="Times New Roman" w:eastAsia="Times New Roman" w:hAnsi="Times New Roman" w:cs="Times New Roman"/>
+          <w:sz w:val="24"/>
+          <w:szCs w:val="24"/>
+          <w:highlight w:val="white"/>
+        </w:rPr>
+        <w:t>вежо</w:t>
+      </w:r>
+      <w:proofErr w:type="spellEnd"/>
+      <w:r>
+        <w:rPr>
+          <w:rFonts w:ascii="Times New Roman" w:eastAsia="Times New Roman" w:hAnsi="Times New Roman" w:cs="Times New Roman"/>
+          <w:sz w:val="24"/>
+          <w:szCs w:val="24"/>
+          <w:highlight w:val="white"/>
+        </w:rPr>
+        <w:t xml:space="preserve">!* </w:t>
+      </w:r>
+      <w:proofErr w:type="spellStart"/>
+      <w:r>
+        <w:rPr>
+          <w:rFonts w:ascii="Times New Roman" w:eastAsia="Times New Roman" w:hAnsi="Times New Roman" w:cs="Times New Roman"/>
+          <w:sz w:val="24"/>
+          <w:szCs w:val="24"/>
+          <w:highlight w:val="white"/>
+        </w:rPr>
+        <w:t>Константине</w:t>
+      </w:r>
+      <w:proofErr w:type="spellEnd"/>
+      <w:r>
+        <w:rPr>
+          <w:rFonts w:ascii="Times New Roman" w:eastAsia="Times New Roman" w:hAnsi="Times New Roman" w:cs="Times New Roman"/>
+          <w:sz w:val="24"/>
+          <w:szCs w:val="24"/>
+          <w:highlight w:val="white"/>
+        </w:rPr>
+        <w:t xml:space="preserve"> блаженний,* за нас до Господа не втомися у молінні,* як той, хто має сміливість, царів окрасо!»</w:t>
       </w:r>
     </w:p>
     <w:p>
@@ -17969,19 +18813,149 @@
         <w:jc w:val="both"/>
         <w:rPr>
           <w:rFonts w:ascii="Times New Roman" w:eastAsia="Times New Roman" w:hAnsi="Times New Roman" w:cs="Times New Roman"/>
-          <w:sz w:val="24"/>
-          <w:szCs w:val="24"/>
+          <w:b/>
+          <w:i/>
+          <w:sz w:val="28"/>
+          <w:szCs w:val="28"/>
           <w:highlight w:val="white"/>
         </w:rPr>
       </w:pPr>
       <w:r>
         <w:rPr>
           <w:rFonts w:ascii="Times New Roman" w:eastAsia="Times New Roman" w:hAnsi="Times New Roman" w:cs="Times New Roman"/>
-          <w:sz w:val="24"/>
-          <w:szCs w:val="24"/>
-          <w:highlight w:val="white"/>
-        </w:rPr>
-        <w:t>Дав Ти, Чоловіколюбче,* благочестивому Твоєму угодникові* Соломонову мудрість,* Давидову смиренність* і апостольське православ’я,* як царів Цар, владарюючих усіх Владар.* Тим-то Твій чоловіколюбний Промисел славимо,* Ісусе всесильний,* Спасе душ наших.</w:t>
+          <w:b/>
+          <w:color w:val="FF0000"/>
+          <w:sz w:val="24"/>
+          <w:szCs w:val="24"/>
+          <w:highlight w:val="white"/>
+        </w:rPr>
+        <w:t xml:space="preserve">Стихири на </w:t>
+      </w:r>
+      <w:proofErr w:type="spellStart"/>
+      <w:r>
+        <w:rPr>
+          <w:rFonts w:ascii="Times New Roman" w:eastAsia="Times New Roman" w:hAnsi="Times New Roman" w:cs="Times New Roman"/>
+          <w:b/>
+          <w:color w:val="FF0000"/>
+          <w:sz w:val="24"/>
+          <w:szCs w:val="24"/>
+          <w:highlight w:val="white"/>
+        </w:rPr>
+        <w:t>стиховні</w:t>
+      </w:r>
+      <w:proofErr w:type="spellEnd"/>
+      <w:r>
+        <w:rPr>
+          <w:rFonts w:ascii="Times New Roman" w:eastAsia="Times New Roman" w:hAnsi="Times New Roman" w:cs="Times New Roman"/>
+          <w:b/>
+          <w:color w:val="FF0000"/>
+          <w:sz w:val="24"/>
+          <w:szCs w:val="24"/>
+          <w:highlight w:val="white"/>
+        </w:rPr>
+        <w:t xml:space="preserve"> :</w:t>
+      </w:r>
+    </w:p>
+    <w:p>
+      <w:pPr>
+        <w:spacing w:after="120" w:line="240" w:lineRule="auto"/>
+        <w:jc w:val="both"/>
+        <w:rPr>
+          <w:rFonts w:ascii="Times New Roman" w:eastAsia="Times New Roman" w:hAnsi="Times New Roman" w:cs="Times New Roman"/>
+          <w:sz w:val="24"/>
+          <w:szCs w:val="24"/>
+          <w:highlight w:val="white"/>
+        </w:rPr>
+      </w:pPr>
+      <w:r>
+        <w:rPr>
+          <w:rFonts w:ascii="Times New Roman" w:eastAsia="Times New Roman" w:hAnsi="Times New Roman" w:cs="Times New Roman"/>
+          <w:i/>
+          <w:color w:val="FF0000"/>
+          <w:sz w:val="24"/>
+          <w:szCs w:val="24"/>
+          <w:highlight w:val="white"/>
+        </w:rPr>
+        <w:t>(г. 2, подібний: Коли з дерева):</w:t>
+      </w:r>
+      <w:r>
+        <w:rPr>
+          <w:rFonts w:ascii="Times New Roman" w:eastAsia="Times New Roman" w:hAnsi="Times New Roman" w:cs="Times New Roman"/>
+          <w:i/>
+          <w:sz w:val="28"/>
+          <w:szCs w:val="28"/>
+          <w:highlight w:val="white"/>
+        </w:rPr>
+        <w:t xml:space="preserve"> </w:t>
+      </w:r>
+      <w:r>
+        <w:rPr>
+          <w:rFonts w:ascii="Times New Roman" w:eastAsia="Times New Roman" w:hAnsi="Times New Roman" w:cs="Times New Roman"/>
+          <w:sz w:val="24"/>
+          <w:szCs w:val="24"/>
+          <w:highlight w:val="white"/>
+        </w:rPr>
+        <w:t xml:space="preserve">Як перший цар серед християн від Бога, </w:t>
+      </w:r>
+      <w:proofErr w:type="spellStart"/>
+      <w:r>
+        <w:rPr>
+          <w:rFonts w:ascii="Times New Roman" w:eastAsia="Times New Roman" w:hAnsi="Times New Roman" w:cs="Times New Roman"/>
+          <w:sz w:val="24"/>
+          <w:szCs w:val="24"/>
+          <w:highlight w:val="white"/>
+        </w:rPr>
+        <w:t>Константине</w:t>
+      </w:r>
+      <w:proofErr w:type="spellEnd"/>
+      <w:r>
+        <w:rPr>
+          <w:rFonts w:ascii="Times New Roman" w:eastAsia="Times New Roman" w:hAnsi="Times New Roman" w:cs="Times New Roman"/>
+          <w:sz w:val="24"/>
+          <w:szCs w:val="24"/>
+          <w:highlight w:val="white"/>
+        </w:rPr>
+        <w:t xml:space="preserve">,* прийняв єси </w:t>
+      </w:r>
+      <w:proofErr w:type="spellStart"/>
+      <w:r>
+        <w:rPr>
+          <w:rFonts w:ascii="Times New Roman" w:eastAsia="Times New Roman" w:hAnsi="Times New Roman" w:cs="Times New Roman"/>
+          <w:sz w:val="24"/>
+          <w:szCs w:val="24"/>
+          <w:highlight w:val="white"/>
+        </w:rPr>
+        <w:t>скипетр</w:t>
+      </w:r>
+      <w:proofErr w:type="spellEnd"/>
+      <w:r>
+        <w:rPr>
+          <w:rFonts w:ascii="Times New Roman" w:eastAsia="Times New Roman" w:hAnsi="Times New Roman" w:cs="Times New Roman"/>
+          <w:sz w:val="24"/>
+          <w:szCs w:val="24"/>
+          <w:highlight w:val="white"/>
+        </w:rPr>
+        <w:t xml:space="preserve">;* тобі бо явилося </w:t>
+      </w:r>
+      <w:proofErr w:type="spellStart"/>
+      <w:r>
+        <w:rPr>
+          <w:rFonts w:ascii="Times New Roman" w:eastAsia="Times New Roman" w:hAnsi="Times New Roman" w:cs="Times New Roman"/>
+          <w:sz w:val="24"/>
+          <w:szCs w:val="24"/>
+          <w:highlight w:val="white"/>
+        </w:rPr>
+        <w:t>спасительне</w:t>
+      </w:r>
+      <w:proofErr w:type="spellEnd"/>
+      <w:r>
+        <w:rPr>
+          <w:rFonts w:ascii="Times New Roman" w:eastAsia="Times New Roman" w:hAnsi="Times New Roman" w:cs="Times New Roman"/>
+          <w:sz w:val="24"/>
+          <w:szCs w:val="24"/>
+          <w:highlight w:val="white"/>
+        </w:rPr>
+        <w:t xml:space="preserve"> знамення, що в землі крилося,* – ним і народи всі підкорив ти під ноги римлян, блаженний,* зброєю незборимою* маючи Животворящий Хрест,* яким і приведений був ти* до Бога нашого.</w:t>
       </w:r>
     </w:p>
     <w:p>
@@ -18002,90 +18976,7 @@
           <w:szCs w:val="24"/>
           <w:highlight w:val="white"/>
         </w:rPr>
-        <w:lastRenderedPageBreak/>
-        <w:t xml:space="preserve">Перший добровільно,* приснопам’ятний царю,* простелив ти багряницю Христові,* в Ньому пізнавши Бога і </w:t>
-      </w:r>
-      <w:proofErr w:type="spellStart"/>
-      <w:r>
-        <w:rPr>
-          <w:rFonts w:ascii="Times New Roman" w:eastAsia="Times New Roman" w:hAnsi="Times New Roman" w:cs="Times New Roman"/>
-          <w:sz w:val="24"/>
-          <w:szCs w:val="24"/>
-          <w:highlight w:val="white"/>
-        </w:rPr>
-        <w:t>Всецаря</w:t>
-      </w:r>
-      <w:proofErr w:type="spellEnd"/>
-      <w:r>
-        <w:rPr>
-          <w:rFonts w:ascii="Times New Roman" w:eastAsia="Times New Roman" w:hAnsi="Times New Roman" w:cs="Times New Roman"/>
-          <w:sz w:val="24"/>
-          <w:szCs w:val="24"/>
-          <w:highlight w:val="white"/>
-        </w:rPr>
-        <w:t xml:space="preserve">, всіх Доброчинця,* що над усяким началом здобуває перемогу* і всяку владу перевищує.* Через це тобі, </w:t>
-      </w:r>
-      <w:proofErr w:type="spellStart"/>
-      <w:r>
-        <w:rPr>
-          <w:rFonts w:ascii="Times New Roman" w:eastAsia="Times New Roman" w:hAnsi="Times New Roman" w:cs="Times New Roman"/>
-          <w:sz w:val="24"/>
-          <w:szCs w:val="24"/>
-          <w:highlight w:val="white"/>
-        </w:rPr>
-        <w:t>Христолюбче</w:t>
-      </w:r>
-      <w:proofErr w:type="spellEnd"/>
-      <w:r>
-        <w:rPr>
-          <w:rFonts w:ascii="Times New Roman" w:eastAsia="Times New Roman" w:hAnsi="Times New Roman" w:cs="Times New Roman"/>
-          <w:sz w:val="24"/>
-          <w:szCs w:val="24"/>
-          <w:highlight w:val="white"/>
-        </w:rPr>
-        <w:t>,* царство справив Ісус, Чоловіколюбець* і Спас душ наших.</w:t>
-      </w:r>
-    </w:p>
-    <w:p>
-      <w:pPr>
-        <w:spacing w:after="120" w:line="240" w:lineRule="auto"/>
-        <w:jc w:val="both"/>
-        <w:rPr>
-          <w:rFonts w:ascii="Times New Roman" w:eastAsia="Times New Roman" w:hAnsi="Times New Roman" w:cs="Times New Roman"/>
-          <w:sz w:val="24"/>
-          <w:szCs w:val="24"/>
-          <w:highlight w:val="white"/>
-        </w:rPr>
-      </w:pPr>
-      <w:r>
-        <w:rPr>
-          <w:rFonts w:ascii="Times New Roman" w:eastAsia="Times New Roman" w:hAnsi="Times New Roman" w:cs="Times New Roman"/>
-          <w:b/>
-          <w:sz w:val="24"/>
-          <w:szCs w:val="24"/>
-          <w:highlight w:val="white"/>
-        </w:rPr>
-        <w:t>Слава:</w:t>
-      </w:r>
-      <w:r>
-        <w:rPr>
-          <w:rFonts w:ascii="Times New Roman" w:eastAsia="Times New Roman" w:hAnsi="Times New Roman" w:cs="Times New Roman"/>
-          <w:i/>
-          <w:color w:val="FF0000"/>
-          <w:sz w:val="24"/>
-          <w:szCs w:val="24"/>
-          <w:highlight w:val="white"/>
-        </w:rPr>
-        <w:t xml:space="preserve"> (г. 2): </w:t>
-      </w:r>
-      <w:r>
-        <w:rPr>
-          <w:rFonts w:ascii="Times New Roman" w:eastAsia="Times New Roman" w:hAnsi="Times New Roman" w:cs="Times New Roman"/>
-          <w:sz w:val="24"/>
-          <w:szCs w:val="24"/>
-          <w:highlight w:val="white"/>
-        </w:rPr>
-        <w:t xml:space="preserve">З багатства дарів найкращі прийнявши від Бога,* царю можновладний,* </w:t>
+        <w:t xml:space="preserve">Воістину блаженне лоно й освячена утроба,* що тебе носила, володарю,* для світу жаданий,* християн радосте, </w:t>
       </w:r>
       <w:proofErr w:type="spellStart"/>
       <w:r>
@@ -18105,75 +18996,27 @@
           <w:szCs w:val="24"/>
           <w:highlight w:val="white"/>
         </w:rPr>
-        <w:t xml:space="preserve"> превеликий,* ти в них добре успіху досяг:* бо осяяний променями </w:t>
-      </w:r>
-      <w:proofErr w:type="spellStart"/>
-      <w:r>
-        <w:rPr>
-          <w:rFonts w:ascii="Times New Roman" w:eastAsia="Times New Roman" w:hAnsi="Times New Roman" w:cs="Times New Roman"/>
-          <w:sz w:val="24"/>
-          <w:szCs w:val="24"/>
-          <w:highlight w:val="white"/>
-        </w:rPr>
-        <w:t>Всесвятого</w:t>
-      </w:r>
-      <w:proofErr w:type="spellEnd"/>
-      <w:r>
-        <w:rPr>
-          <w:rFonts w:ascii="Times New Roman" w:eastAsia="Times New Roman" w:hAnsi="Times New Roman" w:cs="Times New Roman"/>
-          <w:sz w:val="24"/>
-          <w:szCs w:val="24"/>
-          <w:highlight w:val="white"/>
-        </w:rPr>
-        <w:t xml:space="preserve"> Духа* завдяки святителю Сильвестрові,* серед царів явився ти непереможним,* вселенну дав єси як дар Сотворителеві твоєму* і царюючий град благочестивий.* Тим-то, маючи сміливість,* хоч лише на смертному одрі охрещений,* не переставай благати Христа Бога* дарувати всім, що творять пам’ять твою, гріхів прощення* і велику милість.</w:t>
-      </w:r>
-    </w:p>
-    <w:p>
-      <w:pPr>
-        <w:spacing w:before="240" w:after="240" w:line="240" w:lineRule="auto"/>
-        <w:rPr>
-          <w:rFonts w:ascii="Times New Roman" w:eastAsia="Times New Roman" w:hAnsi="Times New Roman" w:cs="Times New Roman"/>
-          <w:b/>
-          <w:color w:val="FF0000"/>
-          <w:sz w:val="24"/>
-          <w:szCs w:val="24"/>
-          <w:highlight w:val="white"/>
-        </w:rPr>
-      </w:pPr>
-      <w:r>
-        <w:rPr>
-          <w:rFonts w:ascii="Times New Roman" w:eastAsia="Times New Roman" w:hAnsi="Times New Roman" w:cs="Times New Roman"/>
-          <w:b/>
-          <w:color w:val="FF0000"/>
-          <w:sz w:val="24"/>
-          <w:szCs w:val="24"/>
-          <w:highlight w:val="white"/>
-        </w:rPr>
-        <w:t xml:space="preserve">Стихири на </w:t>
-      </w:r>
-      <w:proofErr w:type="spellStart"/>
-      <w:r>
-        <w:rPr>
-          <w:rFonts w:ascii="Times New Roman" w:eastAsia="Times New Roman" w:hAnsi="Times New Roman" w:cs="Times New Roman"/>
-          <w:b/>
-          <w:color w:val="FF0000"/>
-          <w:sz w:val="24"/>
-          <w:szCs w:val="24"/>
-          <w:highlight w:val="white"/>
-        </w:rPr>
-        <w:t>литії</w:t>
-      </w:r>
-      <w:proofErr w:type="spellEnd"/>
-      <w:r>
-        <w:rPr>
-          <w:rFonts w:ascii="Times New Roman" w:eastAsia="Times New Roman" w:hAnsi="Times New Roman" w:cs="Times New Roman"/>
-          <w:b/>
-          <w:color w:val="FF0000"/>
-          <w:sz w:val="24"/>
-          <w:szCs w:val="24"/>
-          <w:highlight w:val="white"/>
-        </w:rPr>
-        <w:t>:</w:t>
+        <w:t xml:space="preserve"> </w:t>
+      </w:r>
+      <w:proofErr w:type="spellStart"/>
+      <w:r>
+        <w:rPr>
+          <w:rFonts w:ascii="Times New Roman" w:eastAsia="Times New Roman" w:hAnsi="Times New Roman" w:cs="Times New Roman"/>
+          <w:sz w:val="24"/>
+          <w:szCs w:val="24"/>
+          <w:highlight w:val="white"/>
+        </w:rPr>
+        <w:t>боговінчаний</w:t>
+      </w:r>
+      <w:proofErr w:type="spellEnd"/>
+      <w:r>
+        <w:rPr>
+          <w:rFonts w:ascii="Times New Roman" w:eastAsia="Times New Roman" w:hAnsi="Times New Roman" w:cs="Times New Roman"/>
+          <w:sz w:val="24"/>
+          <w:szCs w:val="24"/>
+          <w:highlight w:val="white"/>
+        </w:rPr>
+        <w:t>,* римлян славо, багатство і захисте сиріт і вдів,* покрове принижених,* і справжнє виправлення тих, хто від утисків потрапив у безвихідь,* і полонених визволення!</w:t>
       </w:r>
     </w:p>
     <w:p>
@@ -18190,815 +19033,61 @@
       <w:r>
         <w:rPr>
           <w:rFonts w:ascii="Times New Roman" w:eastAsia="Times New Roman" w:hAnsi="Times New Roman" w:cs="Times New Roman"/>
-          <w:i/>
-          <w:color w:val="FF0000"/>
-          <w:sz w:val="24"/>
-          <w:szCs w:val="24"/>
-          <w:highlight w:val="white"/>
-        </w:rPr>
-        <w:t>(г. 1):</w:t>
-      </w:r>
-      <w:r>
-        <w:rPr>
-          <w:rFonts w:ascii="Times New Roman" w:eastAsia="Times New Roman" w:hAnsi="Times New Roman" w:cs="Times New Roman"/>
-          <w:sz w:val="24"/>
-          <w:szCs w:val="24"/>
-          <w:highlight w:val="white"/>
-        </w:rPr>
-        <w:t xml:space="preserve"> Як </w:t>
-      </w:r>
-      <w:proofErr w:type="spellStart"/>
-      <w:r>
-        <w:rPr>
-          <w:rFonts w:ascii="Times New Roman" w:eastAsia="Times New Roman" w:hAnsi="Times New Roman" w:cs="Times New Roman"/>
-          <w:sz w:val="24"/>
-          <w:szCs w:val="24"/>
-          <w:highlight w:val="white"/>
-        </w:rPr>
-        <w:t>довг</w:t>
-      </w:r>
-      <w:proofErr w:type="spellEnd"/>
-      <w:r>
-        <w:rPr>
-          <w:rFonts w:ascii="Times New Roman" w:eastAsia="Times New Roman" w:hAnsi="Times New Roman" w:cs="Times New Roman"/>
-          <w:sz w:val="24"/>
-          <w:szCs w:val="24"/>
-          <w:highlight w:val="white"/>
-        </w:rPr>
-        <w:t xml:space="preserve"> велить, звершуємо пам’ять твою, </w:t>
-      </w:r>
-      <w:proofErr w:type="spellStart"/>
-      <w:r>
-        <w:rPr>
-          <w:rFonts w:ascii="Times New Roman" w:eastAsia="Times New Roman" w:hAnsi="Times New Roman" w:cs="Times New Roman"/>
-          <w:sz w:val="24"/>
-          <w:szCs w:val="24"/>
-          <w:highlight w:val="white"/>
-        </w:rPr>
-        <w:t>Константине</w:t>
-      </w:r>
-      <w:proofErr w:type="spellEnd"/>
-      <w:r>
-        <w:rPr>
-          <w:rFonts w:ascii="Times New Roman" w:eastAsia="Times New Roman" w:hAnsi="Times New Roman" w:cs="Times New Roman"/>
-          <w:sz w:val="24"/>
-          <w:szCs w:val="24"/>
-          <w:highlight w:val="white"/>
-        </w:rPr>
-        <w:t xml:space="preserve"> рівноапостольний,* всіх царів підвалино і похвало;* бо, бувши просвічений променями Духа,* ти світлом звеселив усю Церкву Христову,* собори вірних звідусіль зібравши у світлому граді </w:t>
-      </w:r>
-      <w:proofErr w:type="spellStart"/>
-      <w:r>
-        <w:rPr>
-          <w:rFonts w:ascii="Times New Roman" w:eastAsia="Times New Roman" w:hAnsi="Times New Roman" w:cs="Times New Roman"/>
-          <w:sz w:val="24"/>
-          <w:szCs w:val="24"/>
-          <w:highlight w:val="white"/>
-        </w:rPr>
-        <w:t>Нікейському</w:t>
-      </w:r>
-      <w:proofErr w:type="spellEnd"/>
-      <w:r>
-        <w:rPr>
-          <w:rFonts w:ascii="Times New Roman" w:eastAsia="Times New Roman" w:hAnsi="Times New Roman" w:cs="Times New Roman"/>
-          <w:sz w:val="24"/>
-          <w:szCs w:val="24"/>
-          <w:highlight w:val="white"/>
-        </w:rPr>
-        <w:t xml:space="preserve">,* де </w:t>
-      </w:r>
-      <w:proofErr w:type="spellStart"/>
-      <w:r>
-        <w:rPr>
-          <w:rFonts w:ascii="Times New Roman" w:eastAsia="Times New Roman" w:hAnsi="Times New Roman" w:cs="Times New Roman"/>
-          <w:sz w:val="24"/>
-          <w:szCs w:val="24"/>
-          <w:highlight w:val="white"/>
-        </w:rPr>
-        <w:t>згасилося</w:t>
-      </w:r>
-      <w:proofErr w:type="spellEnd"/>
-      <w:r>
-        <w:rPr>
-          <w:rFonts w:ascii="Times New Roman" w:eastAsia="Times New Roman" w:hAnsi="Times New Roman" w:cs="Times New Roman"/>
-          <w:sz w:val="24"/>
-          <w:szCs w:val="24"/>
-          <w:highlight w:val="white"/>
-        </w:rPr>
-        <w:t xml:space="preserve"> зухвальство злочестивих* і знемогли та знавісніли єретичні язики,* православних же вознісся вінець,* коли явилася їх віра.* Звідти від них прославився </w:t>
-      </w:r>
-      <w:proofErr w:type="spellStart"/>
-      <w:r>
-        <w:rPr>
-          <w:rFonts w:ascii="Times New Roman" w:eastAsia="Times New Roman" w:hAnsi="Times New Roman" w:cs="Times New Roman"/>
-          <w:sz w:val="24"/>
-          <w:szCs w:val="24"/>
-          <w:highlight w:val="white"/>
-        </w:rPr>
-        <w:t>всеправославний</w:t>
-      </w:r>
-      <w:proofErr w:type="spellEnd"/>
-      <w:r>
-        <w:rPr>
-          <w:rFonts w:ascii="Times New Roman" w:eastAsia="Times New Roman" w:hAnsi="Times New Roman" w:cs="Times New Roman"/>
-          <w:sz w:val="24"/>
-          <w:szCs w:val="24"/>
-          <w:highlight w:val="white"/>
-        </w:rPr>
-        <w:t>* і всім царям був проголошений як отець* ти, що перший багряницю від Бога прийняв.* Тому просимо тебе ми, що звершуємо пам’ять твою вірно:* випроси очищення гріхів для душ наших!</w:t>
-      </w:r>
-    </w:p>
-    <w:p>
-      <w:pPr>
-        <w:spacing w:before="240" w:after="240" w:line="240" w:lineRule="auto"/>
-        <w:jc w:val="both"/>
-        <w:rPr>
-          <w:rFonts w:ascii="Times New Roman" w:eastAsia="Times New Roman" w:hAnsi="Times New Roman" w:cs="Times New Roman"/>
-          <w:sz w:val="24"/>
-          <w:szCs w:val="24"/>
-          <w:highlight w:val="white"/>
-        </w:rPr>
-      </w:pPr>
-      <w:r>
-        <w:rPr>
-          <w:rFonts w:ascii="Times New Roman" w:eastAsia="Times New Roman" w:hAnsi="Times New Roman" w:cs="Times New Roman"/>
-          <w:i/>
-          <w:color w:val="FF0000"/>
-          <w:sz w:val="24"/>
-          <w:szCs w:val="24"/>
-          <w:highlight w:val="white"/>
-        </w:rPr>
-        <w:t xml:space="preserve">(г. 2): </w:t>
-      </w:r>
-      <w:r>
-        <w:rPr>
-          <w:rFonts w:ascii="Times New Roman" w:eastAsia="Times New Roman" w:hAnsi="Times New Roman" w:cs="Times New Roman"/>
-          <w:sz w:val="24"/>
-          <w:szCs w:val="24"/>
-          <w:highlight w:val="white"/>
-        </w:rPr>
-        <w:t xml:space="preserve">Не від людей звання прийняв ти,* але, як богонатхненний Павло,* мав його радше з висоти, преславний </w:t>
-      </w:r>
-      <w:proofErr w:type="spellStart"/>
-      <w:r>
-        <w:rPr>
-          <w:rFonts w:ascii="Times New Roman" w:eastAsia="Times New Roman" w:hAnsi="Times New Roman" w:cs="Times New Roman"/>
-          <w:sz w:val="24"/>
-          <w:szCs w:val="24"/>
-          <w:highlight w:val="white"/>
-        </w:rPr>
-        <w:t>Константине</w:t>
-      </w:r>
-      <w:proofErr w:type="spellEnd"/>
-      <w:r>
-        <w:rPr>
-          <w:rFonts w:ascii="Times New Roman" w:eastAsia="Times New Roman" w:hAnsi="Times New Roman" w:cs="Times New Roman"/>
-          <w:sz w:val="24"/>
-          <w:szCs w:val="24"/>
-          <w:highlight w:val="white"/>
-        </w:rPr>
-        <w:t xml:space="preserve"> рівноапостольний,* від Христа Бога.* Бо знамення Хреста на небі видівши,* ним був ти уловлений, як найкращий улов,* у ньому і переможцем нездоланним* проти видимих і невидимих ворогів ти явився.* Тим-то молимо тебе як гарячого заступника* ми, земні, достойно пам’ять твою почитаючи,* у дерзновенні випросити нам просвічення, очищення* і великої милости.</w:t>
-      </w:r>
-    </w:p>
-    <w:p>
-      <w:pPr>
-        <w:spacing w:before="240" w:after="240" w:line="240" w:lineRule="auto"/>
-        <w:jc w:val="both"/>
-        <w:rPr>
-          <w:rFonts w:ascii="Times New Roman" w:eastAsia="Times New Roman" w:hAnsi="Times New Roman" w:cs="Times New Roman"/>
-          <w:sz w:val="24"/>
-          <w:szCs w:val="24"/>
-          <w:highlight w:val="white"/>
-        </w:rPr>
-      </w:pPr>
-      <w:r>
-        <w:rPr>
-          <w:rFonts w:ascii="Times New Roman" w:eastAsia="Times New Roman" w:hAnsi="Times New Roman" w:cs="Times New Roman"/>
-          <w:sz w:val="24"/>
-          <w:szCs w:val="24"/>
-          <w:highlight w:val="white"/>
-        </w:rPr>
-        <w:t xml:space="preserve">Благочестивого Константина пам’ять, як миро </w:t>
-      </w:r>
-      <w:proofErr w:type="spellStart"/>
-      <w:r>
-        <w:rPr>
-          <w:rFonts w:ascii="Times New Roman" w:eastAsia="Times New Roman" w:hAnsi="Times New Roman" w:cs="Times New Roman"/>
-          <w:sz w:val="24"/>
-          <w:szCs w:val="24"/>
-          <w:highlight w:val="white"/>
-        </w:rPr>
-        <w:t>вичерпуване</w:t>
-      </w:r>
-      <w:proofErr w:type="spellEnd"/>
-      <w:r>
-        <w:rPr>
-          <w:rFonts w:ascii="Times New Roman" w:eastAsia="Times New Roman" w:hAnsi="Times New Roman" w:cs="Times New Roman"/>
-          <w:sz w:val="24"/>
-          <w:szCs w:val="24"/>
-          <w:highlight w:val="white"/>
-        </w:rPr>
-        <w:t xml:space="preserve"> днесь возсіяла:* Христа бо жадаючи, він ідолів знехтував,* храм воздвиг на землі Розп’ятому нас ради,* на небесах же отримав у нагороду надії вінець.</w:t>
-      </w:r>
-    </w:p>
-    <w:p>
-      <w:pPr>
-        <w:spacing w:before="240" w:after="240" w:line="240" w:lineRule="auto"/>
-        <w:jc w:val="both"/>
-        <w:rPr>
-          <w:rFonts w:ascii="Times New Roman" w:eastAsia="Times New Roman" w:hAnsi="Times New Roman" w:cs="Times New Roman"/>
-          <w:sz w:val="24"/>
-          <w:szCs w:val="24"/>
-          <w:highlight w:val="white"/>
-        </w:rPr>
-      </w:pPr>
-      <w:r>
-        <w:rPr>
-          <w:rFonts w:ascii="Times New Roman" w:eastAsia="Times New Roman" w:hAnsi="Times New Roman" w:cs="Times New Roman"/>
-          <w:i/>
-          <w:color w:val="FF0000"/>
-          <w:sz w:val="24"/>
-          <w:szCs w:val="24"/>
-          <w:highlight w:val="white"/>
-        </w:rPr>
-        <w:t xml:space="preserve">(г. 3): </w:t>
-      </w:r>
-      <w:r>
-        <w:rPr>
-          <w:rFonts w:ascii="Times New Roman" w:eastAsia="Times New Roman" w:hAnsi="Times New Roman" w:cs="Times New Roman"/>
-          <w:sz w:val="24"/>
-          <w:szCs w:val="24"/>
-          <w:highlight w:val="white"/>
-        </w:rPr>
-        <w:t xml:space="preserve">Юначий вік проходячи,* неначе богонатхненний Павло,* ти з висот прийняв божественну харизму;* і рать лютого войовника всеозброєнням Хреста повергнув,* царів похвало, </w:t>
-      </w:r>
-      <w:proofErr w:type="spellStart"/>
-      <w:r>
-        <w:rPr>
-          <w:rFonts w:ascii="Times New Roman" w:eastAsia="Times New Roman" w:hAnsi="Times New Roman" w:cs="Times New Roman"/>
-          <w:sz w:val="24"/>
-          <w:szCs w:val="24"/>
-          <w:highlight w:val="white"/>
-        </w:rPr>
-        <w:t>Константине</w:t>
-      </w:r>
-      <w:proofErr w:type="spellEnd"/>
-      <w:r>
-        <w:rPr>
-          <w:rFonts w:ascii="Times New Roman" w:eastAsia="Times New Roman" w:hAnsi="Times New Roman" w:cs="Times New Roman"/>
-          <w:sz w:val="24"/>
-          <w:szCs w:val="24"/>
-          <w:highlight w:val="white"/>
-        </w:rPr>
-        <w:t xml:space="preserve"> рівноапостольний,* за нас Господа моли,* щоб спаслися душі наші.</w:t>
-      </w:r>
-    </w:p>
-    <w:p>
-      <w:pPr>
-        <w:spacing w:before="240" w:after="240" w:line="240" w:lineRule="auto"/>
-        <w:jc w:val="both"/>
-        <w:rPr>
-          <w:rFonts w:ascii="Times New Roman" w:eastAsia="Times New Roman" w:hAnsi="Times New Roman" w:cs="Times New Roman"/>
-          <w:sz w:val="24"/>
-          <w:szCs w:val="24"/>
-          <w:highlight w:val="white"/>
-        </w:rPr>
-      </w:pPr>
-      <w:r>
-        <w:rPr>
-          <w:rFonts w:ascii="Times New Roman" w:eastAsia="Times New Roman" w:hAnsi="Times New Roman" w:cs="Times New Roman"/>
-          <w:i/>
-          <w:color w:val="FF0000"/>
-          <w:sz w:val="24"/>
-          <w:szCs w:val="24"/>
-          <w:highlight w:val="white"/>
-        </w:rPr>
-        <w:t xml:space="preserve">(г. 4): </w:t>
-      </w:r>
-      <w:r>
-        <w:rPr>
-          <w:rFonts w:ascii="Times New Roman" w:eastAsia="Times New Roman" w:hAnsi="Times New Roman" w:cs="Times New Roman"/>
-          <w:sz w:val="24"/>
-          <w:szCs w:val="24"/>
-          <w:highlight w:val="white"/>
-        </w:rPr>
-        <w:t xml:space="preserve">Хвалу Богові із тлінних уст* оспівує Божественна пам’ять твоя, </w:t>
-      </w:r>
-      <w:proofErr w:type="spellStart"/>
-      <w:r>
-        <w:rPr>
-          <w:rFonts w:ascii="Times New Roman" w:eastAsia="Times New Roman" w:hAnsi="Times New Roman" w:cs="Times New Roman"/>
-          <w:sz w:val="24"/>
-          <w:szCs w:val="24"/>
-          <w:highlight w:val="white"/>
-        </w:rPr>
-        <w:t>Константине</w:t>
-      </w:r>
-      <w:proofErr w:type="spellEnd"/>
-      <w:r>
-        <w:rPr>
-          <w:rFonts w:ascii="Times New Roman" w:eastAsia="Times New Roman" w:hAnsi="Times New Roman" w:cs="Times New Roman"/>
-          <w:sz w:val="24"/>
-          <w:szCs w:val="24"/>
-          <w:highlight w:val="white"/>
-        </w:rPr>
-        <w:t xml:space="preserve"> всехвальний!* Ти бо явився єси прекрасним воїном слова віри,* зневаживши тесані зображення ідолів;* і нині був </w:t>
-      </w:r>
-      <w:proofErr w:type="spellStart"/>
-      <w:r>
-        <w:rPr>
-          <w:rFonts w:ascii="Times New Roman" w:eastAsia="Times New Roman" w:hAnsi="Times New Roman" w:cs="Times New Roman"/>
-          <w:sz w:val="24"/>
-          <w:szCs w:val="24"/>
-          <w:highlight w:val="white"/>
-        </w:rPr>
-        <w:t>причислений</w:t>
-      </w:r>
-      <w:proofErr w:type="spellEnd"/>
-      <w:r>
-        <w:rPr>
-          <w:rFonts w:ascii="Times New Roman" w:eastAsia="Times New Roman" w:hAnsi="Times New Roman" w:cs="Times New Roman"/>
-          <w:sz w:val="24"/>
-          <w:szCs w:val="24"/>
-          <w:highlight w:val="white"/>
-        </w:rPr>
-        <w:t xml:space="preserve"> до Світла Тройці,* ти, що просвічуєш помисли наші </w:t>
-      </w:r>
-      <w:proofErr w:type="spellStart"/>
-      <w:r>
-        <w:rPr>
-          <w:rFonts w:ascii="Times New Roman" w:eastAsia="Times New Roman" w:hAnsi="Times New Roman" w:cs="Times New Roman"/>
-          <w:sz w:val="24"/>
-          <w:szCs w:val="24"/>
-          <w:highlight w:val="white"/>
-        </w:rPr>
-        <w:t>мольбами</w:t>
-      </w:r>
-      <w:proofErr w:type="spellEnd"/>
-      <w:r>
-        <w:rPr>
-          <w:rFonts w:ascii="Times New Roman" w:eastAsia="Times New Roman" w:hAnsi="Times New Roman" w:cs="Times New Roman"/>
-          <w:sz w:val="24"/>
-          <w:szCs w:val="24"/>
-          <w:highlight w:val="white"/>
-        </w:rPr>
-        <w:t xml:space="preserve"> твоїми.</w:t>
-      </w:r>
-    </w:p>
-    <w:p>
-      <w:pPr>
-        <w:spacing w:after="120" w:line="240" w:lineRule="auto"/>
-        <w:jc w:val="both"/>
-        <w:rPr>
-          <w:rFonts w:ascii="Times New Roman" w:eastAsia="Times New Roman" w:hAnsi="Times New Roman" w:cs="Times New Roman"/>
-          <w:sz w:val="24"/>
-          <w:szCs w:val="24"/>
-          <w:highlight w:val="white"/>
-        </w:rPr>
-      </w:pPr>
-      <w:r>
-        <w:rPr>
-          <w:rFonts w:ascii="Times New Roman" w:eastAsia="Times New Roman" w:hAnsi="Times New Roman" w:cs="Times New Roman"/>
-          <w:b/>
-          <w:sz w:val="24"/>
-          <w:szCs w:val="24"/>
-          <w:highlight w:val="white"/>
-        </w:rPr>
-        <w:t>Слава:</w:t>
-      </w:r>
-      <w:r>
-        <w:rPr>
-          <w:rFonts w:ascii="Times New Roman" w:eastAsia="Times New Roman" w:hAnsi="Times New Roman" w:cs="Times New Roman"/>
-          <w:i/>
-          <w:color w:val="FF0000"/>
-          <w:sz w:val="24"/>
-          <w:szCs w:val="24"/>
-          <w:highlight w:val="white"/>
-        </w:rPr>
-        <w:t xml:space="preserve"> (г. 5): </w:t>
-      </w:r>
-      <w:r>
-        <w:rPr>
-          <w:rFonts w:ascii="Times New Roman" w:eastAsia="Times New Roman" w:hAnsi="Times New Roman" w:cs="Times New Roman"/>
-          <w:sz w:val="24"/>
-          <w:szCs w:val="24"/>
-          <w:highlight w:val="white"/>
-        </w:rPr>
-        <w:t xml:space="preserve">Церква,* прикрасившись днесь могутністю твоєю, царю,* таїнственно веселиться* і твою </w:t>
-      </w:r>
-      <w:proofErr w:type="spellStart"/>
-      <w:r>
-        <w:rPr>
-          <w:rFonts w:ascii="Times New Roman" w:eastAsia="Times New Roman" w:hAnsi="Times New Roman" w:cs="Times New Roman"/>
-          <w:sz w:val="24"/>
-          <w:szCs w:val="24"/>
-          <w:highlight w:val="white"/>
-        </w:rPr>
-        <w:t>всечесну</w:t>
-      </w:r>
-      <w:proofErr w:type="spellEnd"/>
-      <w:r>
-        <w:rPr>
-          <w:rFonts w:ascii="Times New Roman" w:eastAsia="Times New Roman" w:hAnsi="Times New Roman" w:cs="Times New Roman"/>
-          <w:sz w:val="24"/>
-          <w:szCs w:val="24"/>
-          <w:highlight w:val="white"/>
-        </w:rPr>
-        <w:t xml:space="preserve"> пам’ять* по достоїнству </w:t>
-      </w:r>
-      <w:proofErr w:type="spellStart"/>
-      <w:r>
-        <w:rPr>
-          <w:rFonts w:ascii="Times New Roman" w:eastAsia="Times New Roman" w:hAnsi="Times New Roman" w:cs="Times New Roman"/>
-          <w:sz w:val="24"/>
-          <w:szCs w:val="24"/>
-          <w:highlight w:val="white"/>
-        </w:rPr>
-        <w:t>прехвально</w:t>
-      </w:r>
-      <w:proofErr w:type="spellEnd"/>
-      <w:r>
-        <w:rPr>
-          <w:rFonts w:ascii="Times New Roman" w:eastAsia="Times New Roman" w:hAnsi="Times New Roman" w:cs="Times New Roman"/>
-          <w:sz w:val="24"/>
-          <w:szCs w:val="24"/>
-          <w:highlight w:val="white"/>
-        </w:rPr>
-        <w:t xml:space="preserve"> вшановує, кличучи:* «Радуйся, ти, що Павлові </w:t>
-      </w:r>
-      <w:proofErr w:type="spellStart"/>
-      <w:r>
-        <w:rPr>
-          <w:rFonts w:ascii="Times New Roman" w:eastAsia="Times New Roman" w:hAnsi="Times New Roman" w:cs="Times New Roman"/>
-          <w:sz w:val="24"/>
-          <w:szCs w:val="24"/>
-          <w:highlight w:val="white"/>
-        </w:rPr>
-        <w:t>поревнував</w:t>
-      </w:r>
-      <w:proofErr w:type="spellEnd"/>
-      <w:r>
-        <w:rPr>
-          <w:rFonts w:ascii="Times New Roman" w:eastAsia="Times New Roman" w:hAnsi="Times New Roman" w:cs="Times New Roman"/>
-          <w:sz w:val="24"/>
-          <w:szCs w:val="24"/>
-          <w:highlight w:val="white"/>
-        </w:rPr>
-        <w:t xml:space="preserve">,* і Хрест Христовий узяв,* і тенета розірвав </w:t>
-      </w:r>
-      <w:proofErr w:type="spellStart"/>
-      <w:r>
-        <w:rPr>
-          <w:rFonts w:ascii="Times New Roman" w:eastAsia="Times New Roman" w:hAnsi="Times New Roman" w:cs="Times New Roman"/>
-          <w:sz w:val="24"/>
-          <w:szCs w:val="24"/>
-          <w:highlight w:val="white"/>
-        </w:rPr>
-        <w:t>протиборця</w:t>
-      </w:r>
-      <w:proofErr w:type="spellEnd"/>
-      <w:r>
-        <w:rPr>
-          <w:rFonts w:ascii="Times New Roman" w:eastAsia="Times New Roman" w:hAnsi="Times New Roman" w:cs="Times New Roman"/>
-          <w:sz w:val="24"/>
-          <w:szCs w:val="24"/>
-          <w:highlight w:val="white"/>
-        </w:rPr>
-        <w:t xml:space="preserve">!* Радуйся, з-поміж царів </w:t>
-      </w:r>
-      <w:proofErr w:type="spellStart"/>
-      <w:r>
-        <w:rPr>
-          <w:rFonts w:ascii="Times New Roman" w:eastAsia="Times New Roman" w:hAnsi="Times New Roman" w:cs="Times New Roman"/>
-          <w:sz w:val="24"/>
-          <w:szCs w:val="24"/>
-          <w:highlight w:val="white"/>
-        </w:rPr>
-        <w:t>найособливіший</w:t>
-      </w:r>
-      <w:proofErr w:type="spellEnd"/>
-      <w:r>
-        <w:rPr>
-          <w:rFonts w:ascii="Times New Roman" w:eastAsia="Times New Roman" w:hAnsi="Times New Roman" w:cs="Times New Roman"/>
-          <w:sz w:val="24"/>
-          <w:szCs w:val="24"/>
-          <w:highlight w:val="white"/>
-        </w:rPr>
-        <w:t xml:space="preserve">* і апостолам рівний шаною!* Радуйся, вірних підпоро* і царів передня </w:t>
-      </w:r>
-      <w:proofErr w:type="spellStart"/>
-      <w:r>
-        <w:rPr>
-          <w:rFonts w:ascii="Times New Roman" w:eastAsia="Times New Roman" w:hAnsi="Times New Roman" w:cs="Times New Roman"/>
-          <w:sz w:val="24"/>
-          <w:szCs w:val="24"/>
-          <w:highlight w:val="white"/>
-        </w:rPr>
-        <w:t>вежо</w:t>
-      </w:r>
-      <w:proofErr w:type="spellEnd"/>
-      <w:r>
-        <w:rPr>
-          <w:rFonts w:ascii="Times New Roman" w:eastAsia="Times New Roman" w:hAnsi="Times New Roman" w:cs="Times New Roman"/>
-          <w:sz w:val="24"/>
-          <w:szCs w:val="24"/>
-          <w:highlight w:val="white"/>
-        </w:rPr>
-        <w:t xml:space="preserve">!* </w:t>
-      </w:r>
-      <w:proofErr w:type="spellStart"/>
-      <w:r>
-        <w:rPr>
-          <w:rFonts w:ascii="Times New Roman" w:eastAsia="Times New Roman" w:hAnsi="Times New Roman" w:cs="Times New Roman"/>
-          <w:sz w:val="24"/>
-          <w:szCs w:val="24"/>
-          <w:highlight w:val="white"/>
-        </w:rPr>
-        <w:t>Константине</w:t>
-      </w:r>
-      <w:proofErr w:type="spellEnd"/>
-      <w:r>
-        <w:rPr>
-          <w:rFonts w:ascii="Times New Roman" w:eastAsia="Times New Roman" w:hAnsi="Times New Roman" w:cs="Times New Roman"/>
-          <w:sz w:val="24"/>
-          <w:szCs w:val="24"/>
-          <w:highlight w:val="white"/>
-        </w:rPr>
-        <w:t xml:space="preserve"> блаженний,* за нас до Господа не втомися у молінні,* як той, хто має сміливість, царів окрасо!»</w:t>
-      </w:r>
-    </w:p>
-    <w:p>
-      <w:pPr>
-        <w:spacing w:before="240" w:after="240" w:line="240" w:lineRule="auto"/>
-        <w:jc w:val="both"/>
-        <w:rPr>
-          <w:rFonts w:ascii="Times New Roman" w:eastAsia="Times New Roman" w:hAnsi="Times New Roman" w:cs="Times New Roman"/>
-          <w:b/>
-          <w:i/>
-          <w:sz w:val="28"/>
-          <w:szCs w:val="28"/>
-          <w:highlight w:val="white"/>
-        </w:rPr>
-      </w:pPr>
-      <w:r>
-        <w:rPr>
-          <w:rFonts w:ascii="Times New Roman" w:eastAsia="Times New Roman" w:hAnsi="Times New Roman" w:cs="Times New Roman"/>
-          <w:b/>
-          <w:color w:val="FF0000"/>
+          <w:sz w:val="24"/>
+          <w:szCs w:val="24"/>
+          <w:highlight w:val="white"/>
+        </w:rPr>
+        <w:t xml:space="preserve">Пристрастю і любов’ю Христовою зранена,* мати пресолодкого паростка* </w:t>
+      </w:r>
+      <w:proofErr w:type="spellStart"/>
+      <w:r>
+        <w:rPr>
+          <w:rFonts w:ascii="Times New Roman" w:eastAsia="Times New Roman" w:hAnsi="Times New Roman" w:cs="Times New Roman"/>
+          <w:sz w:val="24"/>
+          <w:szCs w:val="24"/>
+          <w:highlight w:val="white"/>
+        </w:rPr>
+        <w:t>горливо</w:t>
+      </w:r>
+      <w:proofErr w:type="spellEnd"/>
+      <w:r>
+        <w:rPr>
+          <w:rFonts w:ascii="Times New Roman" w:eastAsia="Times New Roman" w:hAnsi="Times New Roman" w:cs="Times New Roman"/>
+          <w:sz w:val="24"/>
+          <w:szCs w:val="24"/>
+          <w:highlight w:val="white"/>
+        </w:rPr>
+        <w:t xml:space="preserve"> прийшла у святий Сіон,* на місце святе,* на якому </w:t>
+      </w:r>
+      <w:proofErr w:type="spellStart"/>
+      <w:r>
+        <w:rPr>
+          <w:rFonts w:ascii="Times New Roman" w:eastAsia="Times New Roman" w:hAnsi="Times New Roman" w:cs="Times New Roman"/>
+          <w:sz w:val="24"/>
+          <w:szCs w:val="24"/>
+          <w:highlight w:val="white"/>
+        </w:rPr>
+        <w:t>розп’явся</w:t>
+      </w:r>
+      <w:proofErr w:type="spellEnd"/>
+      <w:r>
+        <w:rPr>
+          <w:rFonts w:ascii="Times New Roman" w:eastAsia="Times New Roman" w:hAnsi="Times New Roman" w:cs="Times New Roman"/>
+          <w:sz w:val="24"/>
+          <w:szCs w:val="24"/>
+          <w:highlight w:val="white"/>
+        </w:rPr>
+        <w:t xml:space="preserve"> добровільно Спаситель </w:t>
+      </w:r>
+      <w:r>
+        <w:rPr>
+          <w:rFonts w:ascii="Times New Roman" w:eastAsia="Times New Roman" w:hAnsi="Times New Roman" w:cs="Times New Roman"/>
           <w:sz w:val="24"/>
           <w:szCs w:val="24"/>
           <w:highlight w:val="white"/>
         </w:rPr>
         <w:lastRenderedPageBreak/>
-        <w:t xml:space="preserve">Стихири на </w:t>
-      </w:r>
-      <w:proofErr w:type="spellStart"/>
-      <w:r>
-        <w:rPr>
-          <w:rFonts w:ascii="Times New Roman" w:eastAsia="Times New Roman" w:hAnsi="Times New Roman" w:cs="Times New Roman"/>
-          <w:b/>
-          <w:color w:val="FF0000"/>
-          <w:sz w:val="24"/>
-          <w:szCs w:val="24"/>
-          <w:highlight w:val="white"/>
-        </w:rPr>
-        <w:t>стиховні</w:t>
-      </w:r>
-      <w:proofErr w:type="spellEnd"/>
-      <w:r>
-        <w:rPr>
-          <w:rFonts w:ascii="Times New Roman" w:eastAsia="Times New Roman" w:hAnsi="Times New Roman" w:cs="Times New Roman"/>
-          <w:b/>
-          <w:color w:val="FF0000"/>
-          <w:sz w:val="24"/>
-          <w:szCs w:val="24"/>
-          <w:highlight w:val="white"/>
-        </w:rPr>
-        <w:t xml:space="preserve"> :</w:t>
-      </w:r>
-    </w:p>
-    <w:p>
-      <w:pPr>
-        <w:spacing w:after="120" w:line="240" w:lineRule="auto"/>
-        <w:jc w:val="both"/>
-        <w:rPr>
-          <w:rFonts w:ascii="Times New Roman" w:eastAsia="Times New Roman" w:hAnsi="Times New Roman" w:cs="Times New Roman"/>
-          <w:sz w:val="24"/>
-          <w:szCs w:val="24"/>
-          <w:highlight w:val="white"/>
-        </w:rPr>
-      </w:pPr>
-      <w:r>
-        <w:rPr>
-          <w:rFonts w:ascii="Times New Roman" w:eastAsia="Times New Roman" w:hAnsi="Times New Roman" w:cs="Times New Roman"/>
-          <w:i/>
-          <w:color w:val="FF0000"/>
-          <w:sz w:val="24"/>
-          <w:szCs w:val="24"/>
-          <w:highlight w:val="white"/>
-        </w:rPr>
-        <w:t>(г. 2, подібний: Коли з дерева):</w:t>
-      </w:r>
-      <w:r>
-        <w:rPr>
-          <w:rFonts w:ascii="Times New Roman" w:eastAsia="Times New Roman" w:hAnsi="Times New Roman" w:cs="Times New Roman"/>
-          <w:i/>
-          <w:sz w:val="28"/>
-          <w:szCs w:val="28"/>
-          <w:highlight w:val="white"/>
-        </w:rPr>
-        <w:t xml:space="preserve"> </w:t>
-      </w:r>
-      <w:r>
-        <w:rPr>
-          <w:rFonts w:ascii="Times New Roman" w:eastAsia="Times New Roman" w:hAnsi="Times New Roman" w:cs="Times New Roman"/>
-          <w:sz w:val="24"/>
-          <w:szCs w:val="24"/>
-          <w:highlight w:val="white"/>
-        </w:rPr>
-        <w:t xml:space="preserve">Як перший цар серед християн від Бога, </w:t>
-      </w:r>
-      <w:proofErr w:type="spellStart"/>
-      <w:r>
-        <w:rPr>
-          <w:rFonts w:ascii="Times New Roman" w:eastAsia="Times New Roman" w:hAnsi="Times New Roman" w:cs="Times New Roman"/>
-          <w:sz w:val="24"/>
-          <w:szCs w:val="24"/>
-          <w:highlight w:val="white"/>
-        </w:rPr>
-        <w:t>Константине</w:t>
-      </w:r>
-      <w:proofErr w:type="spellEnd"/>
-      <w:r>
-        <w:rPr>
-          <w:rFonts w:ascii="Times New Roman" w:eastAsia="Times New Roman" w:hAnsi="Times New Roman" w:cs="Times New Roman"/>
-          <w:sz w:val="24"/>
-          <w:szCs w:val="24"/>
-          <w:highlight w:val="white"/>
-        </w:rPr>
-        <w:t xml:space="preserve">,* прийняв єси </w:t>
-      </w:r>
-      <w:proofErr w:type="spellStart"/>
-      <w:r>
-        <w:rPr>
-          <w:rFonts w:ascii="Times New Roman" w:eastAsia="Times New Roman" w:hAnsi="Times New Roman" w:cs="Times New Roman"/>
-          <w:sz w:val="24"/>
-          <w:szCs w:val="24"/>
-          <w:highlight w:val="white"/>
-        </w:rPr>
-        <w:t>скипетр</w:t>
-      </w:r>
-      <w:proofErr w:type="spellEnd"/>
-      <w:r>
-        <w:rPr>
-          <w:rFonts w:ascii="Times New Roman" w:eastAsia="Times New Roman" w:hAnsi="Times New Roman" w:cs="Times New Roman"/>
-          <w:sz w:val="24"/>
-          <w:szCs w:val="24"/>
-          <w:highlight w:val="white"/>
-        </w:rPr>
-        <w:t xml:space="preserve">;* тобі бо явилося </w:t>
-      </w:r>
-      <w:proofErr w:type="spellStart"/>
-      <w:r>
-        <w:rPr>
-          <w:rFonts w:ascii="Times New Roman" w:eastAsia="Times New Roman" w:hAnsi="Times New Roman" w:cs="Times New Roman"/>
-          <w:sz w:val="24"/>
-          <w:szCs w:val="24"/>
-          <w:highlight w:val="white"/>
-        </w:rPr>
-        <w:t>спасительне</w:t>
-      </w:r>
-      <w:proofErr w:type="spellEnd"/>
-      <w:r>
-        <w:rPr>
-          <w:rFonts w:ascii="Times New Roman" w:eastAsia="Times New Roman" w:hAnsi="Times New Roman" w:cs="Times New Roman"/>
-          <w:sz w:val="24"/>
-          <w:szCs w:val="24"/>
-          <w:highlight w:val="white"/>
-        </w:rPr>
-        <w:t xml:space="preserve"> знамення, що в землі крилося,* – ним і народи всі підкорив ти під ноги римлян, блаженний,* зброєю незборимою* маючи Животворящий Хрест,* яким і приведений був ти* до Бога нашого.</w:t>
-      </w:r>
-    </w:p>
-    <w:p>
-      <w:pPr>
-        <w:spacing w:before="240" w:after="240" w:line="240" w:lineRule="auto"/>
-        <w:jc w:val="both"/>
-        <w:rPr>
-          <w:rFonts w:ascii="Times New Roman" w:eastAsia="Times New Roman" w:hAnsi="Times New Roman" w:cs="Times New Roman"/>
-          <w:sz w:val="24"/>
-          <w:szCs w:val="24"/>
-          <w:highlight w:val="white"/>
-        </w:rPr>
-      </w:pPr>
-      <w:r>
-        <w:rPr>
-          <w:rFonts w:ascii="Times New Roman" w:eastAsia="Times New Roman" w:hAnsi="Times New Roman" w:cs="Times New Roman"/>
-          <w:sz w:val="24"/>
-          <w:szCs w:val="24"/>
-          <w:highlight w:val="white"/>
-        </w:rPr>
-        <w:t xml:space="preserve">Воістину блаженне лоно й освячена утроба,* що тебе носила, володарю,* для світу жаданий,* християн радосте, </w:t>
-      </w:r>
-      <w:proofErr w:type="spellStart"/>
-      <w:r>
-        <w:rPr>
-          <w:rFonts w:ascii="Times New Roman" w:eastAsia="Times New Roman" w:hAnsi="Times New Roman" w:cs="Times New Roman"/>
-          <w:sz w:val="24"/>
-          <w:szCs w:val="24"/>
-          <w:highlight w:val="white"/>
-        </w:rPr>
-        <w:t>Константине</w:t>
-      </w:r>
-      <w:proofErr w:type="spellEnd"/>
-      <w:r>
-        <w:rPr>
-          <w:rFonts w:ascii="Times New Roman" w:eastAsia="Times New Roman" w:hAnsi="Times New Roman" w:cs="Times New Roman"/>
-          <w:sz w:val="24"/>
-          <w:szCs w:val="24"/>
-          <w:highlight w:val="white"/>
-        </w:rPr>
-        <w:t xml:space="preserve"> </w:t>
-      </w:r>
-      <w:proofErr w:type="spellStart"/>
-      <w:r>
-        <w:rPr>
-          <w:rFonts w:ascii="Times New Roman" w:eastAsia="Times New Roman" w:hAnsi="Times New Roman" w:cs="Times New Roman"/>
-          <w:sz w:val="24"/>
-          <w:szCs w:val="24"/>
-          <w:highlight w:val="white"/>
-        </w:rPr>
-        <w:t>боговінчаний</w:t>
-      </w:r>
-      <w:proofErr w:type="spellEnd"/>
-      <w:r>
-        <w:rPr>
-          <w:rFonts w:ascii="Times New Roman" w:eastAsia="Times New Roman" w:hAnsi="Times New Roman" w:cs="Times New Roman"/>
-          <w:sz w:val="24"/>
-          <w:szCs w:val="24"/>
-          <w:highlight w:val="white"/>
-        </w:rPr>
-        <w:t>,* римлян славо, багатство і захисте сиріт і вдів,* покрове принижених,* і справжнє виправлення тих, хто від утисків потрапив у безвихідь,* і полонених визволення!</w:t>
-      </w:r>
-    </w:p>
-    <w:p>
-      <w:pPr>
-        <w:spacing w:before="240" w:after="240" w:line="240" w:lineRule="auto"/>
-        <w:jc w:val="both"/>
-        <w:rPr>
-          <w:rFonts w:ascii="Times New Roman" w:eastAsia="Times New Roman" w:hAnsi="Times New Roman" w:cs="Times New Roman"/>
-          <w:sz w:val="24"/>
-          <w:szCs w:val="24"/>
-          <w:highlight w:val="white"/>
-        </w:rPr>
-      </w:pPr>
-      <w:r>
-        <w:rPr>
-          <w:rFonts w:ascii="Times New Roman" w:eastAsia="Times New Roman" w:hAnsi="Times New Roman" w:cs="Times New Roman"/>
-          <w:sz w:val="24"/>
-          <w:szCs w:val="24"/>
-          <w:highlight w:val="white"/>
-        </w:rPr>
-        <w:t xml:space="preserve">Пристрастю і любов’ю Христовою зранена,* мати пресолодкого паростка* </w:t>
-      </w:r>
-      <w:proofErr w:type="spellStart"/>
-      <w:r>
-        <w:rPr>
-          <w:rFonts w:ascii="Times New Roman" w:eastAsia="Times New Roman" w:hAnsi="Times New Roman" w:cs="Times New Roman"/>
-          <w:sz w:val="24"/>
-          <w:szCs w:val="24"/>
-          <w:highlight w:val="white"/>
-        </w:rPr>
-        <w:t>горливо</w:t>
-      </w:r>
-      <w:proofErr w:type="spellEnd"/>
-      <w:r>
-        <w:rPr>
-          <w:rFonts w:ascii="Times New Roman" w:eastAsia="Times New Roman" w:hAnsi="Times New Roman" w:cs="Times New Roman"/>
-          <w:sz w:val="24"/>
-          <w:szCs w:val="24"/>
-          <w:highlight w:val="white"/>
-        </w:rPr>
-        <w:t xml:space="preserve"> прийшла у святий Сіон,* на місце святе,* на якому </w:t>
-      </w:r>
-      <w:proofErr w:type="spellStart"/>
-      <w:r>
-        <w:rPr>
-          <w:rFonts w:ascii="Times New Roman" w:eastAsia="Times New Roman" w:hAnsi="Times New Roman" w:cs="Times New Roman"/>
-          <w:sz w:val="24"/>
-          <w:szCs w:val="24"/>
-          <w:highlight w:val="white"/>
-        </w:rPr>
-        <w:t>розп’явся</w:t>
-      </w:r>
-      <w:proofErr w:type="spellEnd"/>
-      <w:r>
-        <w:rPr>
-          <w:rFonts w:ascii="Times New Roman" w:eastAsia="Times New Roman" w:hAnsi="Times New Roman" w:cs="Times New Roman"/>
-          <w:sz w:val="24"/>
-          <w:szCs w:val="24"/>
-          <w:highlight w:val="white"/>
-        </w:rPr>
-        <w:t xml:space="preserve"> добровільно Спаситель наш, щоб спасти нас;* і там, Хрест узявши, з радістю </w:t>
+        <w:t xml:space="preserve">наш, щоб спасти нас;* і там, Хрест узявши, з радістю </w:t>
       </w:r>
       <w:proofErr w:type="spellStart"/>
       <w:r>
@@ -19171,6 +19260,34 @@
     </w:p>
     <w:p>
       <w:pPr>
+        <w:pStyle w:val="3"/>
+        <w:rPr>
+          <w:highlight w:val="white"/>
+        </w:rPr>
+      </w:pPr>
+      <w:r>
+        <w:rPr>
+          <w:highlight w:val="white"/>
+        </w:rPr>
+        <w:t xml:space="preserve">Стихири преподобної </w:t>
+      </w:r>
+      <w:proofErr w:type="spellStart"/>
+      <w:r>
+        <w:rPr>
+          <w:highlight w:val="white"/>
+        </w:rPr>
+        <w:t>Євфросинії</w:t>
+      </w:r>
+      <w:proofErr w:type="spellEnd"/>
+      <w:r>
+        <w:rPr>
+          <w:highlight w:val="white"/>
+        </w:rPr>
+        <w:t>.</w:t>
+      </w:r>
+    </w:p>
+    <w:p>
+      <w:pPr>
         <w:spacing w:after="120" w:line="240" w:lineRule="auto"/>
         <w:jc w:val="both"/>
         <w:rPr>
@@ -19189,56 +19306,56 @@
           <w:szCs w:val="24"/>
           <w:highlight w:val="white"/>
         </w:rPr>
-        <w:t xml:space="preserve">(г. 8, подібний: О, преславне чудо): </w:t>
-      </w:r>
-      <w:r>
-        <w:rPr>
-          <w:rFonts w:ascii="Times New Roman" w:eastAsia="Times New Roman" w:hAnsi="Times New Roman" w:cs="Times New Roman"/>
-          <w:sz w:val="24"/>
-          <w:szCs w:val="24"/>
-          <w:highlight w:val="white"/>
-        </w:rPr>
-        <w:t xml:space="preserve">Отче </w:t>
-      </w:r>
-      <w:proofErr w:type="spellStart"/>
-      <w:r>
-        <w:rPr>
-          <w:rFonts w:ascii="Times New Roman" w:eastAsia="Times New Roman" w:hAnsi="Times New Roman" w:cs="Times New Roman"/>
-          <w:sz w:val="24"/>
-          <w:szCs w:val="24"/>
-          <w:highlight w:val="white"/>
-        </w:rPr>
-        <w:t>Михаїле</w:t>
-      </w:r>
-      <w:proofErr w:type="spellEnd"/>
-      <w:r>
-        <w:rPr>
-          <w:rFonts w:ascii="Times New Roman" w:eastAsia="Times New Roman" w:hAnsi="Times New Roman" w:cs="Times New Roman"/>
-          <w:sz w:val="24"/>
-          <w:szCs w:val="24"/>
-          <w:highlight w:val="white"/>
-        </w:rPr>
-        <w:t xml:space="preserve"> богонатхненний,* ти Джерело благ,* і сповнення остаточних бажань,* і істинне блаженство,* якого всяке єство воістину бажає,* достойно сподобився видіти, блаженний.* О красна твоя мужність, славний!* Через неї ти Христові, радіючи, нині </w:t>
-      </w:r>
-      <w:proofErr w:type="spellStart"/>
-      <w:r>
-        <w:rPr>
-          <w:rFonts w:ascii="Times New Roman" w:eastAsia="Times New Roman" w:hAnsi="Times New Roman" w:cs="Times New Roman"/>
-          <w:sz w:val="24"/>
-          <w:szCs w:val="24"/>
-          <w:highlight w:val="white"/>
-        </w:rPr>
-        <w:t>предстоїш</w:t>
-      </w:r>
-      <w:proofErr w:type="spellEnd"/>
-      <w:r>
-        <w:rPr>
-          <w:rFonts w:ascii="Times New Roman" w:eastAsia="Times New Roman" w:hAnsi="Times New Roman" w:cs="Times New Roman"/>
-          <w:sz w:val="24"/>
-          <w:szCs w:val="24"/>
-          <w:highlight w:val="white"/>
-        </w:rPr>
-        <w:t>,* як святитель світлий.</w:t>
+        <w:t xml:space="preserve">(г. 6): </w:t>
+      </w:r>
+      <w:r>
+        <w:rPr>
+          <w:rFonts w:ascii="Times New Roman" w:eastAsia="Times New Roman" w:hAnsi="Times New Roman" w:cs="Times New Roman"/>
+          <w:sz w:val="24"/>
+          <w:szCs w:val="24"/>
+          <w:highlight w:val="white"/>
+        </w:rPr>
+        <w:t xml:space="preserve">Любу Ангелам і цінну чистоту </w:t>
+      </w:r>
+      <w:proofErr w:type="spellStart"/>
+      <w:r>
+        <w:rPr>
+          <w:rFonts w:ascii="Times New Roman" w:eastAsia="Times New Roman" w:hAnsi="Times New Roman" w:cs="Times New Roman"/>
+          <w:sz w:val="24"/>
+          <w:szCs w:val="24"/>
+          <w:highlight w:val="white"/>
+        </w:rPr>
+        <w:t>возлюбивши</w:t>
+      </w:r>
+      <w:proofErr w:type="spellEnd"/>
+      <w:r>
+        <w:rPr>
+          <w:rFonts w:ascii="Times New Roman" w:eastAsia="Times New Roman" w:hAnsi="Times New Roman" w:cs="Times New Roman"/>
+          <w:sz w:val="24"/>
+          <w:szCs w:val="24"/>
+          <w:highlight w:val="white"/>
+        </w:rPr>
+        <w:t xml:space="preserve">,* преподобна мати </w:t>
+      </w:r>
+      <w:proofErr w:type="spellStart"/>
+      <w:r>
+        <w:rPr>
+          <w:rFonts w:ascii="Times New Roman" w:eastAsia="Times New Roman" w:hAnsi="Times New Roman" w:cs="Times New Roman"/>
+          <w:sz w:val="24"/>
+          <w:szCs w:val="24"/>
+          <w:highlight w:val="white"/>
+        </w:rPr>
+        <w:t>Євфросиніє</w:t>
+      </w:r>
+      <w:proofErr w:type="spellEnd"/>
+      <w:r>
+        <w:rPr>
+          <w:rFonts w:ascii="Times New Roman" w:eastAsia="Times New Roman" w:hAnsi="Times New Roman" w:cs="Times New Roman"/>
+          <w:sz w:val="24"/>
+          <w:szCs w:val="24"/>
+          <w:highlight w:val="white"/>
+        </w:rPr>
+        <w:t>,* ти Христові від юности своєї віддала себе в невісти.* Предстоячи Йому нині з Ангелами,* моли за тих, що благочесно вшановують пам’ять твою.</w:t>
       </w:r>
     </w:p>
     <w:p>
@@ -19259,87 +19376,47 @@
           <w:szCs w:val="24"/>
           <w:highlight w:val="white"/>
         </w:rPr>
-        <w:t xml:space="preserve">Отче </w:t>
-      </w:r>
-      <w:proofErr w:type="spellStart"/>
-      <w:r>
-        <w:rPr>
-          <w:rFonts w:ascii="Times New Roman" w:eastAsia="Times New Roman" w:hAnsi="Times New Roman" w:cs="Times New Roman"/>
-          <w:sz w:val="24"/>
-          <w:szCs w:val="24"/>
-          <w:highlight w:val="white"/>
-        </w:rPr>
-        <w:t>Михаїле</w:t>
-      </w:r>
-      <w:proofErr w:type="spellEnd"/>
-      <w:r>
-        <w:rPr>
-          <w:rFonts w:ascii="Times New Roman" w:eastAsia="Times New Roman" w:hAnsi="Times New Roman" w:cs="Times New Roman"/>
-          <w:sz w:val="24"/>
-          <w:szCs w:val="24"/>
-          <w:highlight w:val="white"/>
-        </w:rPr>
-        <w:t xml:space="preserve"> </w:t>
-      </w:r>
-      <w:proofErr w:type="spellStart"/>
-      <w:r>
-        <w:rPr>
-          <w:rFonts w:ascii="Times New Roman" w:eastAsia="Times New Roman" w:hAnsi="Times New Roman" w:cs="Times New Roman"/>
-          <w:sz w:val="24"/>
-          <w:szCs w:val="24"/>
-          <w:highlight w:val="white"/>
-        </w:rPr>
-        <w:t>богоприємний</w:t>
-      </w:r>
-      <w:proofErr w:type="spellEnd"/>
-      <w:r>
-        <w:rPr>
-          <w:rFonts w:ascii="Times New Roman" w:eastAsia="Times New Roman" w:hAnsi="Times New Roman" w:cs="Times New Roman"/>
-          <w:sz w:val="24"/>
-          <w:szCs w:val="24"/>
-          <w:highlight w:val="white"/>
-        </w:rPr>
-        <w:t xml:space="preserve">,* у священства одежу </w:t>
-      </w:r>
-      <w:proofErr w:type="spellStart"/>
-      <w:r>
-        <w:rPr>
-          <w:rFonts w:ascii="Times New Roman" w:eastAsia="Times New Roman" w:hAnsi="Times New Roman" w:cs="Times New Roman"/>
-          <w:sz w:val="24"/>
-          <w:szCs w:val="24"/>
-          <w:highlight w:val="white"/>
-        </w:rPr>
-        <w:t>облечений</w:t>
-      </w:r>
-      <w:proofErr w:type="spellEnd"/>
-      <w:r>
-        <w:rPr>
-          <w:rFonts w:ascii="Times New Roman" w:eastAsia="Times New Roman" w:hAnsi="Times New Roman" w:cs="Times New Roman"/>
-          <w:sz w:val="24"/>
-          <w:szCs w:val="24"/>
-          <w:highlight w:val="white"/>
-        </w:rPr>
-        <w:t xml:space="preserve">,* пішов ти на мученицьке судилище* і до Христа дав привести себе,* подвійними вінцями, блаженний, прикрашений,* святительські чини бачачи.* О несказанна радість твоя, премудрий!* – її спільником воістину стати сподобився ти,* </w:t>
-      </w:r>
-      <w:proofErr w:type="spellStart"/>
-      <w:r>
-        <w:rPr>
-          <w:rFonts w:ascii="Times New Roman" w:eastAsia="Times New Roman" w:hAnsi="Times New Roman" w:cs="Times New Roman"/>
-          <w:sz w:val="24"/>
-          <w:szCs w:val="24"/>
-          <w:highlight w:val="white"/>
-        </w:rPr>
-        <w:t>богоблаженний</w:t>
-      </w:r>
-      <w:proofErr w:type="spellEnd"/>
-      <w:r>
-        <w:rPr>
-          <w:rFonts w:ascii="Times New Roman" w:eastAsia="Times New Roman" w:hAnsi="Times New Roman" w:cs="Times New Roman"/>
-          <w:sz w:val="24"/>
-          <w:szCs w:val="24"/>
-          <w:highlight w:val="white"/>
-        </w:rPr>
-        <w:t>.</w:t>
+        <w:t xml:space="preserve">Ангельське життя наслідуючи,* ти постом і молитвами Христові, мов безплотна, послужила.* Нині з ангельськими чинами оселена в </w:t>
+      </w:r>
+      <w:proofErr w:type="spellStart"/>
+      <w:r>
+        <w:rPr>
+          <w:rFonts w:ascii="Times New Roman" w:eastAsia="Times New Roman" w:hAnsi="Times New Roman" w:cs="Times New Roman"/>
+          <w:sz w:val="24"/>
+          <w:szCs w:val="24"/>
+          <w:highlight w:val="white"/>
+        </w:rPr>
+        <w:t>чертозі</w:t>
+      </w:r>
+      <w:proofErr w:type="spellEnd"/>
+      <w:r>
+        <w:rPr>
+          <w:rFonts w:ascii="Times New Roman" w:eastAsia="Times New Roman" w:hAnsi="Times New Roman" w:cs="Times New Roman"/>
+          <w:sz w:val="24"/>
+          <w:szCs w:val="24"/>
+          <w:highlight w:val="white"/>
+        </w:rPr>
+        <w:t xml:space="preserve"> Безсмертного Жениха твого,* моли Того, Кого возлюбила ти,* за тих, що радісно вшановують </w:t>
+      </w:r>
+      <w:proofErr w:type="spellStart"/>
+      <w:r>
+        <w:rPr>
+          <w:rFonts w:ascii="Times New Roman" w:eastAsia="Times New Roman" w:hAnsi="Times New Roman" w:cs="Times New Roman"/>
+          <w:sz w:val="24"/>
+          <w:szCs w:val="24"/>
+          <w:highlight w:val="white"/>
+        </w:rPr>
+        <w:t>усечесну</w:t>
+      </w:r>
+      <w:proofErr w:type="spellEnd"/>
+      <w:r>
+        <w:rPr>
+          <w:rFonts w:ascii="Times New Roman" w:eastAsia="Times New Roman" w:hAnsi="Times New Roman" w:cs="Times New Roman"/>
+          <w:sz w:val="24"/>
+          <w:szCs w:val="24"/>
+          <w:highlight w:val="white"/>
+        </w:rPr>
+        <w:t xml:space="preserve"> пам’ять твою.</w:t>
       </w:r>
     </w:p>
     <w:p>
@@ -19353,6 +19430,149 @@
           <w:highlight w:val="white"/>
         </w:rPr>
       </w:pPr>
+      <w:proofErr w:type="spellStart"/>
+      <w:r>
+        <w:rPr>
+          <w:rFonts w:ascii="Times New Roman" w:eastAsia="Times New Roman" w:hAnsi="Times New Roman" w:cs="Times New Roman"/>
+          <w:sz w:val="24"/>
+          <w:szCs w:val="24"/>
+          <w:highlight w:val="white"/>
+        </w:rPr>
+        <w:t>Ангелоподібне</w:t>
+      </w:r>
+      <w:proofErr w:type="spellEnd"/>
+      <w:r>
+        <w:rPr>
+          <w:rFonts w:ascii="Times New Roman" w:eastAsia="Times New Roman" w:hAnsi="Times New Roman" w:cs="Times New Roman"/>
+          <w:sz w:val="24"/>
+          <w:szCs w:val="24"/>
+          <w:highlight w:val="white"/>
+        </w:rPr>
+        <w:t xml:space="preserve"> життя обравши,* ти славу дочасну, і багатство, і дім отчий, і обручника земного покинула* і через це </w:t>
+      </w:r>
+      <w:proofErr w:type="spellStart"/>
+      <w:r>
+        <w:rPr>
+          <w:rFonts w:ascii="Times New Roman" w:eastAsia="Times New Roman" w:hAnsi="Times New Roman" w:cs="Times New Roman"/>
+          <w:sz w:val="24"/>
+          <w:szCs w:val="24"/>
+          <w:highlight w:val="white"/>
+        </w:rPr>
+        <w:t>воздаяння</w:t>
+      </w:r>
+      <w:proofErr w:type="spellEnd"/>
+      <w:r>
+        <w:rPr>
+          <w:rFonts w:ascii="Times New Roman" w:eastAsia="Times New Roman" w:hAnsi="Times New Roman" w:cs="Times New Roman"/>
+          <w:sz w:val="24"/>
+          <w:szCs w:val="24"/>
+          <w:highlight w:val="white"/>
+        </w:rPr>
+        <w:t xml:space="preserve"> вічне на небесах отримала,* де, з Ангелами радіючи,* моли за тих, що любов’ю вшановують пам’ять твою.</w:t>
+      </w:r>
+    </w:p>
+    <w:p>
+      <w:pPr>
+        <w:pStyle w:val="3"/>
+        <w:rPr>
+          <w:rFonts w:ascii="Times New Roman" w:eastAsia="Times New Roman" w:hAnsi="Times New Roman" w:cs="Times New Roman"/>
+          <w:i/>
+          <w:color w:val="FF0000"/>
+          <w:sz w:val="24"/>
+          <w:szCs w:val="24"/>
+          <w:highlight w:val="white"/>
+        </w:rPr>
+      </w:pPr>
+      <w:proofErr w:type="spellStart"/>
+      <w:r>
+        <w:rPr>
+          <w:highlight w:val="white"/>
+        </w:rPr>
+        <w:t>Прп</w:t>
+      </w:r>
+      <w:proofErr w:type="spellEnd"/>
+      <w:r>
+        <w:rPr>
+          <w:highlight w:val="white"/>
+        </w:rPr>
+        <w:t xml:space="preserve">. й </w:t>
+      </w:r>
+      <w:proofErr w:type="spellStart"/>
+      <w:r>
+        <w:rPr>
+          <w:highlight w:val="white"/>
+        </w:rPr>
+        <w:t>ісп</w:t>
+      </w:r>
+      <w:proofErr w:type="spellEnd"/>
+      <w:r>
+        <w:rPr>
+          <w:highlight w:val="white"/>
+        </w:rPr>
+        <w:t xml:space="preserve">. Михаїла, </w:t>
+      </w:r>
+      <w:proofErr w:type="spellStart"/>
+      <w:r>
+        <w:rPr>
+          <w:highlight w:val="white"/>
+        </w:rPr>
+        <w:t>єп</w:t>
+      </w:r>
+      <w:proofErr w:type="spellEnd"/>
+      <w:r>
+        <w:rPr>
+          <w:highlight w:val="white"/>
+        </w:rPr>
+        <w:t xml:space="preserve">. </w:t>
+      </w:r>
+      <w:proofErr w:type="spellStart"/>
+      <w:r>
+        <w:rPr>
+          <w:highlight w:val="white"/>
+        </w:rPr>
+        <w:t>Синадського</w:t>
+      </w:r>
+      <w:proofErr w:type="spellEnd"/>
+      <w:r>
+        <w:rPr>
+          <w:highlight w:val="white"/>
+        </w:rPr>
+        <w:t>.</w:t>
+      </w:r>
+      <w:r>
+        <w:rPr>
+          <w:rFonts w:ascii="Times New Roman" w:eastAsia="Times New Roman" w:hAnsi="Times New Roman" w:cs="Times New Roman"/>
+          <w:i/>
+          <w:color w:val="FF0000"/>
+          <w:sz w:val="24"/>
+          <w:szCs w:val="24"/>
+          <w:highlight w:val="white"/>
+        </w:rPr>
+        <w:t xml:space="preserve"> </w:t>
+      </w:r>
+    </w:p>
+    <w:p>
+      <w:pPr>
+        <w:spacing w:after="120" w:line="240" w:lineRule="auto"/>
+        <w:jc w:val="both"/>
+        <w:rPr>
+          <w:rFonts w:ascii="Times New Roman" w:eastAsia="Times New Roman" w:hAnsi="Times New Roman" w:cs="Times New Roman"/>
+          <w:sz w:val="24"/>
+          <w:szCs w:val="24"/>
+          <w:highlight w:val="white"/>
+        </w:rPr>
+      </w:pPr>
+      <w:r>
+        <w:rPr>
+          <w:rFonts w:ascii="Times New Roman" w:eastAsia="Times New Roman" w:hAnsi="Times New Roman" w:cs="Times New Roman"/>
+          <w:i/>
+          <w:color w:val="FF0000"/>
+          <w:sz w:val="24"/>
+          <w:szCs w:val="24"/>
+          <w:highlight w:val="white"/>
+        </w:rPr>
+        <w:t xml:space="preserve">(г. 8, подібний: О, преславне чудо): </w:t>
+      </w:r>
       <w:r>
         <w:rPr>
           <w:rFonts w:ascii="Times New Roman" w:eastAsia="Times New Roman" w:hAnsi="Times New Roman" w:cs="Times New Roman"/>
@@ -19380,7 +19600,67 @@
           <w:szCs w:val="24"/>
           <w:highlight w:val="white"/>
         </w:rPr>
-        <w:t xml:space="preserve"> богомудрий,* ти, як подобає Божому мужеві,* спокус вогонь погасив єси, з висоти зрошуваний,* і проминув його, неспокушений.* Світло приєднався ти, блаженний,* в радості до попередніх святителів, священномученику.* О невимовна твоя і світла оселя!* У неї Христос тебе нині вселив,* як святителя чесного.</w:t>
+        <w:t xml:space="preserve"> </w:t>
+      </w:r>
+      <w:proofErr w:type="spellStart"/>
+      <w:r>
+        <w:rPr>
+          <w:rFonts w:ascii="Times New Roman" w:eastAsia="Times New Roman" w:hAnsi="Times New Roman" w:cs="Times New Roman"/>
+          <w:sz w:val="24"/>
+          <w:szCs w:val="24"/>
+          <w:highlight w:val="white"/>
+        </w:rPr>
+        <w:t>богонатхненний</w:t>
+      </w:r>
+      <w:proofErr w:type="spellEnd"/>
+      <w:r>
+        <w:rPr>
+          <w:rFonts w:ascii="Times New Roman" w:eastAsia="Times New Roman" w:hAnsi="Times New Roman" w:cs="Times New Roman"/>
+          <w:sz w:val="24"/>
+          <w:szCs w:val="24"/>
+          <w:highlight w:val="white"/>
+        </w:rPr>
+        <w:t xml:space="preserve">,* ти Джерело благ,* і сповнення остаточних бажань,* і істинне блаженство,* якого всяке єство воістину бажає,* достойно </w:t>
+      </w:r>
+      <w:proofErr w:type="spellStart"/>
+      <w:r>
+        <w:rPr>
+          <w:rFonts w:ascii="Times New Roman" w:eastAsia="Times New Roman" w:hAnsi="Times New Roman" w:cs="Times New Roman"/>
+          <w:sz w:val="24"/>
+          <w:szCs w:val="24"/>
+          <w:highlight w:val="white"/>
+        </w:rPr>
+        <w:t>сподобився</w:t>
+      </w:r>
+      <w:proofErr w:type="spellEnd"/>
+      <w:r>
+        <w:rPr>
+          <w:rFonts w:ascii="Times New Roman" w:eastAsia="Times New Roman" w:hAnsi="Times New Roman" w:cs="Times New Roman"/>
+          <w:sz w:val="24"/>
+          <w:szCs w:val="24"/>
+          <w:highlight w:val="white"/>
+        </w:rPr>
+        <w:t xml:space="preserve"> видіти, блаженний.* О красна твоя мужність, славний!* Через неї ти Христові, радіючи, нині </w:t>
+      </w:r>
+      <w:proofErr w:type="spellStart"/>
+      <w:r>
+        <w:rPr>
+          <w:rFonts w:ascii="Times New Roman" w:eastAsia="Times New Roman" w:hAnsi="Times New Roman" w:cs="Times New Roman"/>
+          <w:sz w:val="24"/>
+          <w:szCs w:val="24"/>
+          <w:highlight w:val="white"/>
+        </w:rPr>
+        <w:t>предстоїш</w:t>
+      </w:r>
+      <w:proofErr w:type="spellEnd"/>
+      <w:r>
+        <w:rPr>
+          <w:rFonts w:ascii="Times New Roman" w:eastAsia="Times New Roman" w:hAnsi="Times New Roman" w:cs="Times New Roman"/>
+          <w:sz w:val="24"/>
+          <w:szCs w:val="24"/>
+          <w:highlight w:val="white"/>
+        </w:rPr>
+        <w:t>,* як святитель світлий.</w:t>
       </w:r>
     </w:p>
     <w:p>
@@ -19389,43 +19669,180 @@
         <w:jc w:val="both"/>
         <w:rPr>
           <w:rFonts w:ascii="Times New Roman" w:eastAsia="Times New Roman" w:hAnsi="Times New Roman" w:cs="Times New Roman"/>
-          <w:b/>
-          <w:sz w:val="26"/>
-          <w:szCs w:val="26"/>
+          <w:sz w:val="24"/>
+          <w:szCs w:val="24"/>
           <w:highlight w:val="white"/>
         </w:rPr>
       </w:pPr>
       <w:r>
         <w:rPr>
           <w:rFonts w:ascii="Times New Roman" w:eastAsia="Times New Roman" w:hAnsi="Times New Roman" w:cs="Times New Roman"/>
-          <w:b/>
-          <w:sz w:val="26"/>
-          <w:szCs w:val="26"/>
-          <w:highlight w:val="white"/>
-        </w:rPr>
-        <w:t xml:space="preserve">Стихири преподобної </w:t>
-      </w:r>
-      <w:proofErr w:type="spellStart"/>
-      <w:r>
-        <w:rPr>
-          <w:rFonts w:ascii="Times New Roman" w:eastAsia="Times New Roman" w:hAnsi="Times New Roman" w:cs="Times New Roman"/>
-          <w:b/>
-          <w:sz w:val="26"/>
-          <w:szCs w:val="26"/>
-          <w:highlight w:val="white"/>
-        </w:rPr>
-        <w:t>Євфросинії</w:t>
-      </w:r>
-      <w:proofErr w:type="spellEnd"/>
-      <w:r>
-        <w:rPr>
-          <w:rFonts w:ascii="Times New Roman" w:eastAsia="Times New Roman" w:hAnsi="Times New Roman" w:cs="Times New Roman"/>
-          <w:b/>
-          <w:sz w:val="26"/>
-          <w:szCs w:val="26"/>
+          <w:sz w:val="24"/>
+          <w:szCs w:val="24"/>
+          <w:highlight w:val="white"/>
+        </w:rPr>
+        <w:t xml:space="preserve">Отче </w:t>
+      </w:r>
+      <w:proofErr w:type="spellStart"/>
+      <w:r>
+        <w:rPr>
+          <w:rFonts w:ascii="Times New Roman" w:eastAsia="Times New Roman" w:hAnsi="Times New Roman" w:cs="Times New Roman"/>
+          <w:sz w:val="24"/>
+          <w:szCs w:val="24"/>
+          <w:highlight w:val="white"/>
+        </w:rPr>
+        <w:t>Михаїле</w:t>
+      </w:r>
+      <w:proofErr w:type="spellEnd"/>
+      <w:r>
+        <w:rPr>
+          <w:rFonts w:ascii="Times New Roman" w:eastAsia="Times New Roman" w:hAnsi="Times New Roman" w:cs="Times New Roman"/>
+          <w:sz w:val="24"/>
+          <w:szCs w:val="24"/>
+          <w:highlight w:val="white"/>
+        </w:rPr>
+        <w:t xml:space="preserve"> </w:t>
+      </w:r>
+      <w:proofErr w:type="spellStart"/>
+      <w:r>
+        <w:rPr>
+          <w:rFonts w:ascii="Times New Roman" w:eastAsia="Times New Roman" w:hAnsi="Times New Roman" w:cs="Times New Roman"/>
+          <w:sz w:val="24"/>
+          <w:szCs w:val="24"/>
+          <w:highlight w:val="white"/>
+        </w:rPr>
+        <w:t>богоприємний</w:t>
+      </w:r>
+      <w:proofErr w:type="spellEnd"/>
+      <w:r>
+        <w:rPr>
+          <w:rFonts w:ascii="Times New Roman" w:eastAsia="Times New Roman" w:hAnsi="Times New Roman" w:cs="Times New Roman"/>
+          <w:sz w:val="24"/>
+          <w:szCs w:val="24"/>
+          <w:highlight w:val="white"/>
+        </w:rPr>
+        <w:t xml:space="preserve">,* у священства одежу </w:t>
+      </w:r>
+      <w:proofErr w:type="spellStart"/>
+      <w:r>
+        <w:rPr>
+          <w:rFonts w:ascii="Times New Roman" w:eastAsia="Times New Roman" w:hAnsi="Times New Roman" w:cs="Times New Roman"/>
+          <w:sz w:val="24"/>
+          <w:szCs w:val="24"/>
+          <w:highlight w:val="white"/>
+        </w:rPr>
+        <w:t>облечений</w:t>
+      </w:r>
+      <w:proofErr w:type="spellEnd"/>
+      <w:r>
+        <w:rPr>
+          <w:rFonts w:ascii="Times New Roman" w:eastAsia="Times New Roman" w:hAnsi="Times New Roman" w:cs="Times New Roman"/>
+          <w:sz w:val="24"/>
+          <w:szCs w:val="24"/>
+          <w:highlight w:val="white"/>
+        </w:rPr>
+        <w:t xml:space="preserve">,* пішов ти на мученицьке судилище* і до Христа дав привести себе,* подвійними вінцями, блаженний, прикрашений,* святительські чини бачачи.* О несказанна радість твоя, премудрий!* – її спільником воістину стати </w:t>
+      </w:r>
+      <w:proofErr w:type="spellStart"/>
+      <w:r>
+        <w:rPr>
+          <w:rFonts w:ascii="Times New Roman" w:eastAsia="Times New Roman" w:hAnsi="Times New Roman" w:cs="Times New Roman"/>
+          <w:sz w:val="24"/>
+          <w:szCs w:val="24"/>
+          <w:highlight w:val="white"/>
+        </w:rPr>
+        <w:t>сподобився</w:t>
+      </w:r>
+      <w:proofErr w:type="spellEnd"/>
+      <w:r>
+        <w:rPr>
+          <w:rFonts w:ascii="Times New Roman" w:eastAsia="Times New Roman" w:hAnsi="Times New Roman" w:cs="Times New Roman"/>
+          <w:sz w:val="24"/>
+          <w:szCs w:val="24"/>
+          <w:highlight w:val="white"/>
+        </w:rPr>
+        <w:t xml:space="preserve"> ти,* </w:t>
+      </w:r>
+      <w:proofErr w:type="spellStart"/>
+      <w:r>
+        <w:rPr>
+          <w:rFonts w:ascii="Times New Roman" w:eastAsia="Times New Roman" w:hAnsi="Times New Roman" w:cs="Times New Roman"/>
+          <w:sz w:val="24"/>
+          <w:szCs w:val="24"/>
+          <w:highlight w:val="white"/>
+        </w:rPr>
+        <w:t>богоблаженний</w:t>
+      </w:r>
+      <w:proofErr w:type="spellEnd"/>
+      <w:r>
+        <w:rPr>
+          <w:rFonts w:ascii="Times New Roman" w:eastAsia="Times New Roman" w:hAnsi="Times New Roman" w:cs="Times New Roman"/>
+          <w:sz w:val="24"/>
+          <w:szCs w:val="24"/>
           <w:highlight w:val="white"/>
         </w:rPr>
         <w:t>.</w:t>
+      </w:r>
+    </w:p>
+    <w:p>
+      <w:pPr>
+        <w:spacing w:before="240" w:after="240" w:line="240" w:lineRule="auto"/>
+        <w:jc w:val="both"/>
+        <w:rPr>
+          <w:rFonts w:ascii="Times New Roman" w:eastAsia="Times New Roman" w:hAnsi="Times New Roman" w:cs="Times New Roman"/>
+          <w:sz w:val="24"/>
+          <w:szCs w:val="24"/>
+          <w:highlight w:val="white"/>
+        </w:rPr>
+      </w:pPr>
+      <w:r>
+        <w:rPr>
+          <w:rFonts w:ascii="Times New Roman" w:eastAsia="Times New Roman" w:hAnsi="Times New Roman" w:cs="Times New Roman"/>
+          <w:sz w:val="24"/>
+          <w:szCs w:val="24"/>
+          <w:highlight w:val="white"/>
+        </w:rPr>
+        <w:t xml:space="preserve">Отче </w:t>
+      </w:r>
+      <w:proofErr w:type="spellStart"/>
+      <w:r>
+        <w:rPr>
+          <w:rFonts w:ascii="Times New Roman" w:eastAsia="Times New Roman" w:hAnsi="Times New Roman" w:cs="Times New Roman"/>
+          <w:sz w:val="24"/>
+          <w:szCs w:val="24"/>
+          <w:highlight w:val="white"/>
+        </w:rPr>
+        <w:t>Михаїле</w:t>
+      </w:r>
+      <w:proofErr w:type="spellEnd"/>
+      <w:r>
+        <w:rPr>
+          <w:rFonts w:ascii="Times New Roman" w:eastAsia="Times New Roman" w:hAnsi="Times New Roman" w:cs="Times New Roman"/>
+          <w:sz w:val="24"/>
+          <w:szCs w:val="24"/>
+          <w:highlight w:val="white"/>
+        </w:rPr>
+        <w:t xml:space="preserve"> </w:t>
+      </w:r>
+      <w:proofErr w:type="spellStart"/>
+      <w:r>
+        <w:rPr>
+          <w:rFonts w:ascii="Times New Roman" w:eastAsia="Times New Roman" w:hAnsi="Times New Roman" w:cs="Times New Roman"/>
+          <w:sz w:val="24"/>
+          <w:szCs w:val="24"/>
+          <w:highlight w:val="white"/>
+        </w:rPr>
+        <w:t>богомудрий</w:t>
+      </w:r>
+      <w:proofErr w:type="spellEnd"/>
+      <w:r>
+        <w:rPr>
+          <w:rFonts w:ascii="Times New Roman" w:eastAsia="Times New Roman" w:hAnsi="Times New Roman" w:cs="Times New Roman"/>
+          <w:sz w:val="24"/>
+          <w:szCs w:val="24"/>
+          <w:highlight w:val="white"/>
+        </w:rPr>
+        <w:t>,* ти, як подобає Божому мужеві,* спокус вогонь погасив єси, з висоти зрошуваний,* і проминув його, неспокушений.* Світло приєднався ти, блаженний,* в радості до попередніх святителів, священномученику.* О невимовна твоя і світла оселя!* У неї Христос тебе нині вселив,* як святителя чесного.</w:t>
       </w:r>
     </w:p>
     <w:p>
@@ -19442,43 +19859,148 @@
       <w:r>
         <w:rPr>
           <w:rFonts w:ascii="Times New Roman" w:eastAsia="Times New Roman" w:hAnsi="Times New Roman" w:cs="Times New Roman"/>
+          <w:b/>
+          <w:sz w:val="24"/>
+          <w:szCs w:val="24"/>
+          <w:highlight w:val="white"/>
+        </w:rPr>
+        <w:lastRenderedPageBreak/>
+        <w:t>Слава</w:t>
+      </w:r>
+      <w:r>
+        <w:rPr>
+          <w:rFonts w:ascii="Arial" w:eastAsia="Arial" w:hAnsi="Arial" w:cs="Arial"/>
+          <w:color w:val="222222"/>
+          <w:highlight w:val="white"/>
+        </w:rPr>
+        <w:t xml:space="preserve"> </w:t>
+      </w:r>
+      <w:r>
+        <w:rPr>
+          <w:rFonts w:ascii="Times New Roman" w:eastAsia="Times New Roman" w:hAnsi="Times New Roman" w:cs="Times New Roman"/>
           <w:i/>
           <w:color w:val="FF0000"/>
-          <w:sz w:val="24"/>
-          <w:szCs w:val="24"/>
-          <w:highlight w:val="white"/>
-        </w:rPr>
-        <w:lastRenderedPageBreak/>
-        <w:t xml:space="preserve">(г. 6): </w:t>
-      </w:r>
-      <w:r>
-        <w:rPr>
-          <w:rFonts w:ascii="Times New Roman" w:eastAsia="Times New Roman" w:hAnsi="Times New Roman" w:cs="Times New Roman"/>
-          <w:sz w:val="24"/>
-          <w:szCs w:val="24"/>
-          <w:highlight w:val="white"/>
-        </w:rPr>
-        <w:t xml:space="preserve">Любу Ангелам і цінну чистоту </w:t>
-      </w:r>
-      <w:proofErr w:type="spellStart"/>
-      <w:r>
-        <w:rPr>
-          <w:rFonts w:ascii="Times New Roman" w:eastAsia="Times New Roman" w:hAnsi="Times New Roman" w:cs="Times New Roman"/>
-          <w:sz w:val="24"/>
-          <w:szCs w:val="24"/>
-          <w:highlight w:val="white"/>
-        </w:rPr>
-        <w:t>возлюбивши</w:t>
-      </w:r>
-      <w:proofErr w:type="spellEnd"/>
-      <w:r>
-        <w:rPr>
-          <w:rFonts w:ascii="Times New Roman" w:eastAsia="Times New Roman" w:hAnsi="Times New Roman" w:cs="Times New Roman"/>
-          <w:sz w:val="24"/>
-          <w:szCs w:val="24"/>
-          <w:highlight w:val="white"/>
-        </w:rPr>
-        <w:t xml:space="preserve">,* преподобна мати </w:t>
+          <w:highlight w:val="white"/>
+        </w:rPr>
+        <w:t>(г. 6):</w:t>
+      </w:r>
+      <w:r>
+        <w:rPr>
+          <w:rFonts w:ascii="Arial" w:eastAsia="Arial" w:hAnsi="Arial" w:cs="Arial"/>
+          <w:i/>
+          <w:color w:val="FF0000"/>
+          <w:highlight w:val="white"/>
+        </w:rPr>
+        <w:t xml:space="preserve"> </w:t>
+      </w:r>
+      <w:r>
+        <w:rPr>
+          <w:rFonts w:ascii="Times New Roman" w:eastAsia="Times New Roman" w:hAnsi="Times New Roman" w:cs="Times New Roman"/>
+          <w:sz w:val="24"/>
+          <w:szCs w:val="24"/>
+          <w:highlight w:val="white"/>
+        </w:rPr>
+        <w:t xml:space="preserve">Монашого чину оздобу* і </w:t>
+      </w:r>
+      <w:proofErr w:type="spellStart"/>
+      <w:r>
+        <w:rPr>
+          <w:rFonts w:ascii="Times New Roman" w:eastAsia="Times New Roman" w:hAnsi="Times New Roman" w:cs="Times New Roman"/>
+          <w:sz w:val="24"/>
+          <w:szCs w:val="24"/>
+          <w:highlight w:val="white"/>
+        </w:rPr>
+        <w:t>чорноризиць</w:t>
+      </w:r>
+      <w:proofErr w:type="spellEnd"/>
+      <w:r>
+        <w:rPr>
+          <w:rFonts w:ascii="Times New Roman" w:eastAsia="Times New Roman" w:hAnsi="Times New Roman" w:cs="Times New Roman"/>
+          <w:sz w:val="24"/>
+          <w:szCs w:val="24"/>
+          <w:highlight w:val="white"/>
+        </w:rPr>
+        <w:t xml:space="preserve"> похвалу радісно оспіваймо днесь,* Царя Христа, Бога нашого, </w:t>
+      </w:r>
+      <w:proofErr w:type="spellStart"/>
+      <w:r>
+        <w:rPr>
+          <w:rFonts w:ascii="Times New Roman" w:eastAsia="Times New Roman" w:hAnsi="Times New Roman" w:cs="Times New Roman"/>
+          <w:sz w:val="24"/>
+          <w:szCs w:val="24"/>
+          <w:highlight w:val="white"/>
+        </w:rPr>
+        <w:t>восхваляючи</w:t>
+      </w:r>
+      <w:proofErr w:type="spellEnd"/>
+      <w:r>
+        <w:rPr>
+          <w:rFonts w:ascii="Times New Roman" w:eastAsia="Times New Roman" w:hAnsi="Times New Roman" w:cs="Times New Roman"/>
+          <w:sz w:val="24"/>
+          <w:szCs w:val="24"/>
+          <w:highlight w:val="white"/>
+        </w:rPr>
+        <w:t xml:space="preserve">:* Він бо, як Освятитель святих і Похвала преподобних,* прославив нетлінням мощі преподобної Євфросинії.* Перед ними благовірні люди* благоговійно стоячи і з любов’ю їх цілуючи,* зцілення у хворобах приймають і в </w:t>
+      </w:r>
+      <w:proofErr w:type="spellStart"/>
+      <w:r>
+        <w:rPr>
+          <w:rFonts w:ascii="Times New Roman" w:eastAsia="Times New Roman" w:hAnsi="Times New Roman" w:cs="Times New Roman"/>
+          <w:sz w:val="24"/>
+          <w:szCs w:val="24"/>
+          <w:highlight w:val="white"/>
+        </w:rPr>
+        <w:t>скорботах</w:t>
+      </w:r>
+      <w:proofErr w:type="spellEnd"/>
+      <w:r>
+        <w:rPr>
+          <w:rFonts w:ascii="Times New Roman" w:eastAsia="Times New Roman" w:hAnsi="Times New Roman" w:cs="Times New Roman"/>
+          <w:sz w:val="24"/>
+          <w:szCs w:val="24"/>
+          <w:highlight w:val="white"/>
+        </w:rPr>
+        <w:t xml:space="preserve"> – </w:t>
+      </w:r>
+      <w:proofErr w:type="spellStart"/>
+      <w:r>
+        <w:rPr>
+          <w:rFonts w:ascii="Times New Roman" w:eastAsia="Times New Roman" w:hAnsi="Times New Roman" w:cs="Times New Roman"/>
+          <w:sz w:val="24"/>
+          <w:szCs w:val="24"/>
+          <w:highlight w:val="white"/>
+        </w:rPr>
+        <w:t>потішення</w:t>
+      </w:r>
+      <w:proofErr w:type="spellEnd"/>
+      <w:r>
+        <w:rPr>
+          <w:rFonts w:ascii="Times New Roman" w:eastAsia="Times New Roman" w:hAnsi="Times New Roman" w:cs="Times New Roman"/>
+          <w:sz w:val="24"/>
+          <w:szCs w:val="24"/>
+          <w:highlight w:val="white"/>
+        </w:rPr>
+        <w:t xml:space="preserve">,* і радісно з </w:t>
+      </w:r>
+      <w:proofErr w:type="spellStart"/>
+      <w:r>
+        <w:rPr>
+          <w:rFonts w:ascii="Times New Roman" w:eastAsia="Times New Roman" w:hAnsi="Times New Roman" w:cs="Times New Roman"/>
+          <w:sz w:val="24"/>
+          <w:szCs w:val="24"/>
+          <w:highlight w:val="white"/>
+        </w:rPr>
+        <w:t>умилінням</w:t>
+      </w:r>
+      <w:proofErr w:type="spellEnd"/>
+      <w:r>
+        <w:rPr>
+          <w:rFonts w:ascii="Times New Roman" w:eastAsia="Times New Roman" w:hAnsi="Times New Roman" w:cs="Times New Roman"/>
+          <w:sz w:val="24"/>
+          <w:szCs w:val="24"/>
+          <w:highlight w:val="white"/>
+        </w:rPr>
+        <w:t xml:space="preserve"> промовляють:* «Радуйся, </w:t>
       </w:r>
       <w:proofErr w:type="spellStart"/>
       <w:r>
@@ -19498,7 +20020,47 @@
           <w:szCs w:val="24"/>
           <w:highlight w:val="white"/>
         </w:rPr>
-        <w:t>,* ти Христові від юности своєї віддала себе в невісти.* Предстоячи Йому нині з Ангелами,* моли за тих, що благочесно вшановують пам’ять твою.</w:t>
+        <w:t xml:space="preserve">, </w:t>
+      </w:r>
+      <w:proofErr w:type="spellStart"/>
+      <w:r>
+        <w:rPr>
+          <w:rFonts w:ascii="Times New Roman" w:eastAsia="Times New Roman" w:hAnsi="Times New Roman" w:cs="Times New Roman"/>
+          <w:sz w:val="24"/>
+          <w:szCs w:val="24"/>
+          <w:highlight w:val="white"/>
+        </w:rPr>
+        <w:t>невісто</w:t>
+      </w:r>
+      <w:proofErr w:type="spellEnd"/>
+      <w:r>
+        <w:rPr>
+          <w:rFonts w:ascii="Times New Roman" w:eastAsia="Times New Roman" w:hAnsi="Times New Roman" w:cs="Times New Roman"/>
+          <w:sz w:val="24"/>
+          <w:szCs w:val="24"/>
+          <w:highlight w:val="white"/>
+        </w:rPr>
+        <w:t xml:space="preserve"> Христова </w:t>
+      </w:r>
+      <w:proofErr w:type="spellStart"/>
+      <w:r>
+        <w:rPr>
+          <w:rFonts w:ascii="Times New Roman" w:eastAsia="Times New Roman" w:hAnsi="Times New Roman" w:cs="Times New Roman"/>
+          <w:sz w:val="24"/>
+          <w:szCs w:val="24"/>
+          <w:highlight w:val="white"/>
+        </w:rPr>
+        <w:t>всечесная</w:t>
+      </w:r>
+      <w:proofErr w:type="spellEnd"/>
+      <w:r>
+        <w:rPr>
+          <w:rFonts w:ascii="Times New Roman" w:eastAsia="Times New Roman" w:hAnsi="Times New Roman" w:cs="Times New Roman"/>
+          <w:sz w:val="24"/>
+          <w:szCs w:val="24"/>
+          <w:highlight w:val="white"/>
+        </w:rPr>
+        <w:t>!»</w:t>
       </w:r>
     </w:p>
     <w:p>
@@ -19515,321 +20077,11 @@
       <w:r>
         <w:rPr>
           <w:rFonts w:ascii="Times New Roman" w:eastAsia="Times New Roman" w:hAnsi="Times New Roman" w:cs="Times New Roman"/>
-          <w:sz w:val="24"/>
-          <w:szCs w:val="24"/>
-          <w:highlight w:val="white"/>
-        </w:rPr>
-        <w:t xml:space="preserve">Ангельське життя наслідуючи,* ти постом і молитвами Христові, мов безплотна, послужила.* Нині з ангельськими чинами оселена в </w:t>
-      </w:r>
-      <w:proofErr w:type="spellStart"/>
-      <w:r>
-        <w:rPr>
-          <w:rFonts w:ascii="Times New Roman" w:eastAsia="Times New Roman" w:hAnsi="Times New Roman" w:cs="Times New Roman"/>
-          <w:sz w:val="24"/>
-          <w:szCs w:val="24"/>
-          <w:highlight w:val="white"/>
-        </w:rPr>
-        <w:t>чертозі</w:t>
-      </w:r>
-      <w:proofErr w:type="spellEnd"/>
-      <w:r>
-        <w:rPr>
-          <w:rFonts w:ascii="Times New Roman" w:eastAsia="Times New Roman" w:hAnsi="Times New Roman" w:cs="Times New Roman"/>
-          <w:sz w:val="24"/>
-          <w:szCs w:val="24"/>
-          <w:highlight w:val="white"/>
-        </w:rPr>
-        <w:t xml:space="preserve"> Безсмертного Жениха твого,* моли Того, Кого возлюбила ти,* за тих, що радісно вшановують </w:t>
-      </w:r>
-      <w:proofErr w:type="spellStart"/>
-      <w:r>
-        <w:rPr>
-          <w:rFonts w:ascii="Times New Roman" w:eastAsia="Times New Roman" w:hAnsi="Times New Roman" w:cs="Times New Roman"/>
-          <w:sz w:val="24"/>
-          <w:szCs w:val="24"/>
-          <w:highlight w:val="white"/>
-        </w:rPr>
-        <w:t>усечесну</w:t>
-      </w:r>
-      <w:proofErr w:type="spellEnd"/>
-      <w:r>
-        <w:rPr>
-          <w:rFonts w:ascii="Times New Roman" w:eastAsia="Times New Roman" w:hAnsi="Times New Roman" w:cs="Times New Roman"/>
-          <w:sz w:val="24"/>
-          <w:szCs w:val="24"/>
-          <w:highlight w:val="white"/>
-        </w:rPr>
-        <w:t xml:space="preserve"> пам’ять твою.</w:t>
-      </w:r>
-    </w:p>
-    <w:p>
-      <w:pPr>
-        <w:spacing w:before="240" w:after="240" w:line="240" w:lineRule="auto"/>
-        <w:jc w:val="both"/>
-        <w:rPr>
-          <w:rFonts w:ascii="Times New Roman" w:eastAsia="Times New Roman" w:hAnsi="Times New Roman" w:cs="Times New Roman"/>
-          <w:sz w:val="24"/>
-          <w:szCs w:val="24"/>
-          <w:highlight w:val="white"/>
-        </w:rPr>
-      </w:pPr>
-      <w:proofErr w:type="spellStart"/>
-      <w:r>
-        <w:rPr>
-          <w:rFonts w:ascii="Times New Roman" w:eastAsia="Times New Roman" w:hAnsi="Times New Roman" w:cs="Times New Roman"/>
-          <w:sz w:val="24"/>
-          <w:szCs w:val="24"/>
-          <w:highlight w:val="white"/>
-        </w:rPr>
-        <w:t>Ангелоподібне</w:t>
-      </w:r>
-      <w:proofErr w:type="spellEnd"/>
-      <w:r>
-        <w:rPr>
-          <w:rFonts w:ascii="Times New Roman" w:eastAsia="Times New Roman" w:hAnsi="Times New Roman" w:cs="Times New Roman"/>
-          <w:sz w:val="24"/>
-          <w:szCs w:val="24"/>
-          <w:highlight w:val="white"/>
-        </w:rPr>
-        <w:t xml:space="preserve"> життя обравши,* ти славу дочасну, і багатство, і дім отчий, і обручника земного покинула* і через це </w:t>
-      </w:r>
-      <w:proofErr w:type="spellStart"/>
-      <w:r>
-        <w:rPr>
-          <w:rFonts w:ascii="Times New Roman" w:eastAsia="Times New Roman" w:hAnsi="Times New Roman" w:cs="Times New Roman"/>
-          <w:sz w:val="24"/>
-          <w:szCs w:val="24"/>
-          <w:highlight w:val="white"/>
-        </w:rPr>
-        <w:t>воздаяння</w:t>
-      </w:r>
-      <w:proofErr w:type="spellEnd"/>
-      <w:r>
-        <w:rPr>
-          <w:rFonts w:ascii="Times New Roman" w:eastAsia="Times New Roman" w:hAnsi="Times New Roman" w:cs="Times New Roman"/>
-          <w:sz w:val="24"/>
-          <w:szCs w:val="24"/>
-          <w:highlight w:val="white"/>
-        </w:rPr>
-        <w:t xml:space="preserve"> вічне на небесах отримала,* де, з Ангелами радіючи,* моли за тих, що любов’ю вшановують пам’ять твою.</w:t>
-      </w:r>
-    </w:p>
-    <w:p>
-      <w:pPr>
-        <w:spacing w:after="120" w:line="240" w:lineRule="auto"/>
-        <w:jc w:val="both"/>
-        <w:rPr>
-          <w:rFonts w:ascii="Times New Roman" w:eastAsia="Times New Roman" w:hAnsi="Times New Roman" w:cs="Times New Roman"/>
-          <w:sz w:val="24"/>
-          <w:szCs w:val="24"/>
-          <w:highlight w:val="white"/>
-        </w:rPr>
-      </w:pPr>
-      <w:r>
-        <w:rPr>
-          <w:rFonts w:ascii="Times New Roman" w:eastAsia="Times New Roman" w:hAnsi="Times New Roman" w:cs="Times New Roman"/>
           <w:b/>
           <w:sz w:val="24"/>
           <w:szCs w:val="24"/>
           <w:highlight w:val="white"/>
         </w:rPr>
-        <w:t>Слава</w:t>
-      </w:r>
-      <w:r>
-        <w:rPr>
-          <w:rFonts w:ascii="Arial" w:eastAsia="Arial" w:hAnsi="Arial" w:cs="Arial"/>
-          <w:color w:val="222222"/>
-          <w:highlight w:val="white"/>
-        </w:rPr>
-        <w:t xml:space="preserve"> </w:t>
-      </w:r>
-      <w:r>
-        <w:rPr>
-          <w:rFonts w:ascii="Times New Roman" w:eastAsia="Times New Roman" w:hAnsi="Times New Roman" w:cs="Times New Roman"/>
-          <w:i/>
-          <w:color w:val="FF0000"/>
-          <w:highlight w:val="white"/>
-        </w:rPr>
-        <w:t>(г. 6):</w:t>
-      </w:r>
-      <w:r>
-        <w:rPr>
-          <w:rFonts w:ascii="Arial" w:eastAsia="Arial" w:hAnsi="Arial" w:cs="Arial"/>
-          <w:i/>
-          <w:color w:val="FF0000"/>
-          <w:highlight w:val="white"/>
-        </w:rPr>
-        <w:t xml:space="preserve"> </w:t>
-      </w:r>
-      <w:r>
-        <w:rPr>
-          <w:rFonts w:ascii="Times New Roman" w:eastAsia="Times New Roman" w:hAnsi="Times New Roman" w:cs="Times New Roman"/>
-          <w:sz w:val="24"/>
-          <w:szCs w:val="24"/>
-          <w:highlight w:val="white"/>
-        </w:rPr>
-        <w:t xml:space="preserve">Монашого чину оздобу* і </w:t>
-      </w:r>
-      <w:proofErr w:type="spellStart"/>
-      <w:r>
-        <w:rPr>
-          <w:rFonts w:ascii="Times New Roman" w:eastAsia="Times New Roman" w:hAnsi="Times New Roman" w:cs="Times New Roman"/>
-          <w:sz w:val="24"/>
-          <w:szCs w:val="24"/>
-          <w:highlight w:val="white"/>
-        </w:rPr>
-        <w:t>чорноризиць</w:t>
-      </w:r>
-      <w:proofErr w:type="spellEnd"/>
-      <w:r>
-        <w:rPr>
-          <w:rFonts w:ascii="Times New Roman" w:eastAsia="Times New Roman" w:hAnsi="Times New Roman" w:cs="Times New Roman"/>
-          <w:sz w:val="24"/>
-          <w:szCs w:val="24"/>
-          <w:highlight w:val="white"/>
-        </w:rPr>
-        <w:t xml:space="preserve"> похвалу радісно оспіваймо днесь,* Царя Христа, Бога нашого, </w:t>
-      </w:r>
-      <w:proofErr w:type="spellStart"/>
-      <w:r>
-        <w:rPr>
-          <w:rFonts w:ascii="Times New Roman" w:eastAsia="Times New Roman" w:hAnsi="Times New Roman" w:cs="Times New Roman"/>
-          <w:sz w:val="24"/>
-          <w:szCs w:val="24"/>
-          <w:highlight w:val="white"/>
-        </w:rPr>
-        <w:t>восхваляючи</w:t>
-      </w:r>
-      <w:proofErr w:type="spellEnd"/>
-      <w:r>
-        <w:rPr>
-          <w:rFonts w:ascii="Times New Roman" w:eastAsia="Times New Roman" w:hAnsi="Times New Roman" w:cs="Times New Roman"/>
-          <w:sz w:val="24"/>
-          <w:szCs w:val="24"/>
-          <w:highlight w:val="white"/>
-        </w:rPr>
-        <w:t xml:space="preserve">:* Він бо, як Освятитель святих і Похвала преподобних,* прославив нетлінням мощі преподобної Євфросинії.* Перед ними благовірні люди* благоговійно стоячи і з любов’ю їх цілуючи,* зцілення у хворобах приймають і в скорботах – </w:t>
-      </w:r>
-      <w:proofErr w:type="spellStart"/>
-      <w:r>
-        <w:rPr>
-          <w:rFonts w:ascii="Times New Roman" w:eastAsia="Times New Roman" w:hAnsi="Times New Roman" w:cs="Times New Roman"/>
-          <w:sz w:val="24"/>
-          <w:szCs w:val="24"/>
-          <w:highlight w:val="white"/>
-        </w:rPr>
-        <w:t>потішення</w:t>
-      </w:r>
-      <w:proofErr w:type="spellEnd"/>
-      <w:r>
-        <w:rPr>
-          <w:rFonts w:ascii="Times New Roman" w:eastAsia="Times New Roman" w:hAnsi="Times New Roman" w:cs="Times New Roman"/>
-          <w:sz w:val="24"/>
-          <w:szCs w:val="24"/>
-          <w:highlight w:val="white"/>
-        </w:rPr>
-        <w:t xml:space="preserve">,* і радісно з </w:t>
-      </w:r>
-      <w:proofErr w:type="spellStart"/>
-      <w:r>
-        <w:rPr>
-          <w:rFonts w:ascii="Times New Roman" w:eastAsia="Times New Roman" w:hAnsi="Times New Roman" w:cs="Times New Roman"/>
-          <w:sz w:val="24"/>
-          <w:szCs w:val="24"/>
-          <w:highlight w:val="white"/>
-        </w:rPr>
-        <w:t>умилінням</w:t>
-      </w:r>
-      <w:proofErr w:type="spellEnd"/>
-      <w:r>
-        <w:rPr>
-          <w:rFonts w:ascii="Times New Roman" w:eastAsia="Times New Roman" w:hAnsi="Times New Roman" w:cs="Times New Roman"/>
-          <w:sz w:val="24"/>
-          <w:szCs w:val="24"/>
-          <w:highlight w:val="white"/>
-        </w:rPr>
-        <w:t xml:space="preserve"> промовляють:* «Радуйся, </w:t>
-      </w:r>
-      <w:proofErr w:type="spellStart"/>
-      <w:r>
-        <w:rPr>
-          <w:rFonts w:ascii="Times New Roman" w:eastAsia="Times New Roman" w:hAnsi="Times New Roman" w:cs="Times New Roman"/>
-          <w:sz w:val="24"/>
-          <w:szCs w:val="24"/>
-          <w:highlight w:val="white"/>
-        </w:rPr>
-        <w:t>Євфросиніє</w:t>
-      </w:r>
-      <w:proofErr w:type="spellEnd"/>
-      <w:r>
-        <w:rPr>
-          <w:rFonts w:ascii="Times New Roman" w:eastAsia="Times New Roman" w:hAnsi="Times New Roman" w:cs="Times New Roman"/>
-          <w:sz w:val="24"/>
-          <w:szCs w:val="24"/>
-          <w:highlight w:val="white"/>
-        </w:rPr>
-        <w:t xml:space="preserve">, </w:t>
-      </w:r>
-      <w:proofErr w:type="spellStart"/>
-      <w:r>
-        <w:rPr>
-          <w:rFonts w:ascii="Times New Roman" w:eastAsia="Times New Roman" w:hAnsi="Times New Roman" w:cs="Times New Roman"/>
-          <w:sz w:val="24"/>
-          <w:szCs w:val="24"/>
-          <w:highlight w:val="white"/>
-        </w:rPr>
-        <w:t>невісто</w:t>
-      </w:r>
-      <w:proofErr w:type="spellEnd"/>
-      <w:r>
-        <w:rPr>
-          <w:rFonts w:ascii="Times New Roman" w:eastAsia="Times New Roman" w:hAnsi="Times New Roman" w:cs="Times New Roman"/>
-          <w:sz w:val="24"/>
-          <w:szCs w:val="24"/>
-          <w:highlight w:val="white"/>
-        </w:rPr>
-        <w:t xml:space="preserve"> Христова </w:t>
-      </w:r>
-      <w:proofErr w:type="spellStart"/>
-      <w:r>
-        <w:rPr>
-          <w:rFonts w:ascii="Times New Roman" w:eastAsia="Times New Roman" w:hAnsi="Times New Roman" w:cs="Times New Roman"/>
-          <w:sz w:val="24"/>
-          <w:szCs w:val="24"/>
-          <w:highlight w:val="white"/>
-        </w:rPr>
-        <w:t>всечесная</w:t>
-      </w:r>
-      <w:proofErr w:type="spellEnd"/>
-      <w:r>
-        <w:rPr>
-          <w:rFonts w:ascii="Times New Roman" w:eastAsia="Times New Roman" w:hAnsi="Times New Roman" w:cs="Times New Roman"/>
-          <w:sz w:val="24"/>
-          <w:szCs w:val="24"/>
-          <w:highlight w:val="white"/>
-        </w:rPr>
-        <w:t>!»</w:t>
-      </w:r>
-    </w:p>
-    <w:p>
-      <w:pPr>
-        <w:spacing w:before="240" w:after="240" w:line="240" w:lineRule="auto"/>
-        <w:jc w:val="both"/>
-        <w:rPr>
-          <w:rFonts w:ascii="Times New Roman" w:eastAsia="Times New Roman" w:hAnsi="Times New Roman" w:cs="Times New Roman"/>
-          <w:sz w:val="24"/>
-          <w:szCs w:val="24"/>
-          <w:highlight w:val="white"/>
-        </w:rPr>
-      </w:pPr>
-      <w:r>
-        <w:rPr>
-          <w:rFonts w:ascii="Times New Roman" w:eastAsia="Times New Roman" w:hAnsi="Times New Roman" w:cs="Times New Roman"/>
-          <w:b/>
-          <w:sz w:val="24"/>
-          <w:szCs w:val="24"/>
-          <w:highlight w:val="white"/>
-        </w:rPr>
         <w:t>І нині:</w:t>
       </w:r>
       <w:r>
@@ -19899,7 +20151,27 @@
           <w:szCs w:val="24"/>
           <w:highlight w:val="white"/>
         </w:rPr>
-        <w:t xml:space="preserve">,* пісенними похвалами оспіваймо, мовлячи:* «Радуйся, Діво-Матір Чистая, Світильнику </w:t>
+        <w:t xml:space="preserve">,* пісенними похвалами оспіваймо, мовлячи:* «Радуйся, Діво-Матір </w:t>
+      </w:r>
+      <w:proofErr w:type="spellStart"/>
+      <w:r>
+        <w:rPr>
+          <w:rFonts w:ascii="Times New Roman" w:eastAsia="Times New Roman" w:hAnsi="Times New Roman" w:cs="Times New Roman"/>
+          <w:sz w:val="24"/>
+          <w:szCs w:val="24"/>
+          <w:highlight w:val="white"/>
+        </w:rPr>
+        <w:t>Чистая</w:t>
+      </w:r>
+      <w:proofErr w:type="spellEnd"/>
+      <w:r>
+        <w:rPr>
+          <w:rFonts w:ascii="Times New Roman" w:eastAsia="Times New Roman" w:hAnsi="Times New Roman" w:cs="Times New Roman"/>
+          <w:sz w:val="24"/>
+          <w:szCs w:val="24"/>
+          <w:highlight w:val="white"/>
+        </w:rPr>
+        <w:t xml:space="preserve">, Світильнику </w:t>
       </w:r>
       <w:proofErr w:type="spellStart"/>
       <w:r>
@@ -23224,7 +23496,15 @@
         <w:t xml:space="preserve">30 </w:t>
       </w:r>
       <w:r>
-        <w:t xml:space="preserve">Прп. Ісаакія, </w:t>
+        <w:t xml:space="preserve">Прп. </w:t>
+      </w:r>
+      <w:proofErr w:type="spellStart"/>
+      <w:r>
+        <w:t>Ісаакія</w:t>
+      </w:r>
+      <w:proofErr w:type="spellEnd"/>
+      <w:r>
+        <w:t xml:space="preserve">, </w:t>
       </w:r>
       <w:proofErr w:type="spellStart"/>
       <w:r>
@@ -23944,7 +24224,6 @@
     <w:basedOn w:val="a"/>
     <w:next w:val="a"/>
     <w:uiPriority w:val="9"/>
-    <w:semiHidden/>
     <w:unhideWhenUsed/>
     <w:qFormat/>
     <w:pPr>

</xml_diff>